<commit_message>
Created final plots and tables
</commit_message>
<xml_diff>
--- a/Manuscript/Ecological Modelling/Third submission/Supplement.docx
+++ b/Manuscript/Ecological Modelling/Third submission/Supplement.docx
@@ -243,8 +243,6 @@
       <w:pPr>
         <w:rPr>
           <w:rFonts w:ascii="Futura" w:hAnsi="Futura" w:cs="Futura Medium"/>
-          <w:b/>
-          <w:bCs/>
           <w:sz w:val="20"/>
           <w:szCs w:val="20"/>
           <w:lang w:val="en-US"/>
@@ -347,16 +345,7 @@
           <w:szCs w:val="20"/>
           <w:lang w:val="en-US"/>
         </w:rPr>
-        <w:t>)</w:t>
-      </w:r>
-      <w:r>
-        <w:rPr>
-          <w:rFonts w:ascii="Futura Medium" w:hAnsi="Futura Medium" w:cs="Futura Medium"/>
-          <w:sz w:val="20"/>
-          <w:szCs w:val="20"/>
-          <w:lang w:val="en-US"/>
-        </w:rPr>
-        <w:t xml:space="preserve"> </w:t>
+        <w:t xml:space="preserve">) </w:t>
       </w:r>
       <w:proofErr w:type="spellStart"/>
       <w:r>
@@ -453,7 +442,7 @@
           <w:szCs w:val="20"/>
           <w:lang w:val="en-US"/>
         </w:rPr>
-        <w:t>×</w:t>
+        <w:t xml:space="preserve">× </w:t>
       </w:r>
       <w:r>
         <w:rPr>
@@ -462,6 +451,15 @@
           <w:szCs w:val="20"/>
           <w:lang w:val="en-US"/>
         </w:rPr>
+        <w:t>8 chains are given as mean ± standard deviation.</w:t>
+      </w:r>
+      <w:r>
+        <w:rPr>
+          <w:rFonts w:ascii="Futura Medium" w:hAnsi="Futura Medium" w:cs="Futura Medium"/>
+          <w:sz w:val="20"/>
+          <w:szCs w:val="20"/>
+          <w:lang w:val="en-US"/>
+        </w:rPr>
         <w:t xml:space="preserve"> </w:t>
       </w:r>
       <w:r>
@@ -471,7 +469,7 @@
           <w:szCs w:val="20"/>
           <w:lang w:val="en-US"/>
         </w:rPr>
-        <w:t>8 chains are given as mean ± standard deviation.</w:t>
+        <w:t>E</w:t>
       </w:r>
       <w:r>
         <w:rPr>
@@ -480,16 +478,124 @@
           <w:szCs w:val="20"/>
           <w:lang w:val="en-US"/>
         </w:rPr>
+        <w:t>xpected log predictive density (ELPD</w:t>
+      </w:r>
+      <w:r>
+        <w:rPr>
+          <w:rFonts w:ascii="Futura Medium" w:hAnsi="Futura Medium" w:cs="Futura Medium"/>
+          <w:sz w:val="20"/>
+          <w:szCs w:val="20"/>
+          <w:lang w:val="en-US"/>
+        </w:rPr>
+        <w:t>)</w:t>
+      </w:r>
+      <w:r>
+        <w:rPr>
+          <w:rFonts w:ascii="Futura Medium" w:hAnsi="Futura Medium" w:cs="Futura Medium"/>
+          <w:sz w:val="20"/>
+          <w:szCs w:val="20"/>
+          <w:lang w:val="en-US"/>
+        </w:rPr>
+        <w:t xml:space="preserve">, a measure of predictive </w:t>
+      </w:r>
+      <w:r>
+        <w:rPr>
+          <w:rFonts w:ascii="Futura Medium" w:hAnsi="Futura Medium" w:cs="Futura Medium"/>
+          <w:sz w:val="20"/>
+          <w:szCs w:val="20"/>
+          <w:lang w:val="en-US"/>
+        </w:rPr>
+        <w:t>accuracy</w:t>
+      </w:r>
+      <w:r>
+        <w:rPr>
+          <w:rFonts w:ascii="Futura Medium" w:hAnsi="Futura Medium" w:cs="Futura Medium"/>
+          <w:sz w:val="20"/>
+          <w:szCs w:val="20"/>
+          <w:lang w:val="en-US"/>
+        </w:rPr>
+        <w:t>,</w:t>
+      </w:r>
+      <w:r>
+        <w:rPr>
+          <w:rFonts w:ascii="Futura" w:hAnsi="Futura" w:cs="Futura"/>
+          <w:sz w:val="20"/>
+          <w:szCs w:val="20"/>
+          <w:lang w:val="en-US"/>
+        </w:rPr>
         <w:t xml:space="preserve"> </w:t>
       </w:r>
       <w:r>
         <w:rPr>
+          <w:rFonts w:ascii="Futura" w:hAnsi="Futura" w:cs="Futura"/>
+          <w:sz w:val="20"/>
+          <w:szCs w:val="20"/>
+          <w:lang w:val="en-US"/>
+        </w:rPr>
+        <w:t>ELPD</w:t>
+      </w:r>
+      <w:r>
+        <w:rPr>
+          <w:rFonts w:ascii="Futura" w:hAnsi="Futura" w:cs="Futura"/>
+          <w:sz w:val="20"/>
+          <w:szCs w:val="20"/>
+          <w:lang w:val="en-US"/>
+        </w:rPr>
+        <w:t xml:space="preserve"> </w:t>
+      </w:r>
+      <w:r>
+        <w:rPr>
+          <w:rFonts w:ascii="Futura" w:hAnsi="Futura" w:cs="Futura"/>
+          <w:sz w:val="20"/>
+          <w:szCs w:val="20"/>
+          <w:lang w:val="en-US"/>
+        </w:rPr>
+        <w:t>relative</w:t>
+      </w:r>
+      <w:r>
+        <w:rPr>
+          <w:rFonts w:ascii="Futura" w:hAnsi="Futura" w:cs="Futura"/>
+          <w:sz w:val="20"/>
+          <w:szCs w:val="20"/>
+          <w:lang w:val="en-US"/>
+        </w:rPr>
+        <w:t xml:space="preserve"> to the best performing model per study</w:t>
+      </w:r>
+      <w:r>
+        <w:rPr>
+          <w:rFonts w:ascii="Futura" w:hAnsi="Futura" w:cs="Futura"/>
+          <w:sz w:val="20"/>
+          <w:szCs w:val="20"/>
+          <w:lang w:val="en-US"/>
+        </w:rPr>
+        <w:t xml:space="preserve"> (</w:t>
+      </w:r>
+      <w:r>
+        <w:rPr>
+          <w:rFonts w:ascii="Futura" w:hAnsi="Futura" w:cs="Futura"/>
+          <w:sz w:val="20"/>
+          <w:szCs w:val="20"/>
+          <w:lang w:val="en-US"/>
+        </w:rPr>
+        <w:t>ΔELPD</w:t>
+      </w:r>
+      <w:r>
+        <w:rPr>
+          <w:rFonts w:ascii="Futura" w:hAnsi="Futura" w:cs="Futura"/>
+          <w:sz w:val="20"/>
+          <w:szCs w:val="20"/>
+          <w:lang w:val="en-US"/>
+        </w:rPr>
+        <w:t>)</w:t>
+      </w:r>
+      <w:r>
+        <w:rPr>
           <w:rFonts w:ascii="Futura Medium" w:hAnsi="Futura Medium" w:cs="Futura Medium"/>
           <w:sz w:val="20"/>
           <w:szCs w:val="20"/>
           <w:lang w:val="en-US"/>
         </w:rPr>
-        <w:t>E</w:t>
+        <w:t xml:space="preserve">, and </w:t>
       </w:r>
       <w:r>
         <w:rPr>
@@ -498,7 +604,7 @@
           <w:szCs w:val="20"/>
           <w:lang w:val="en-US"/>
         </w:rPr>
-        <w:t>xpected log predictive density (ELPD</w:t>
+        <w:t>the</w:t>
       </w:r>
       <w:r>
         <w:rPr>
@@ -507,6 +613,63 @@
           <w:szCs w:val="20"/>
           <w:lang w:val="en-US"/>
         </w:rPr>
+        <w:t xml:space="preserve"> </w:t>
+      </w:r>
+      <w:r>
+        <w:rPr>
+          <w:rFonts w:ascii="Futura Medium" w:hAnsi="Futura Medium" w:cs="Futura Medium"/>
+          <w:sz w:val="20"/>
+          <w:szCs w:val="20"/>
+          <w:lang w:val="en-US"/>
+        </w:rPr>
+        <w:t>difference between ELPD and the log predictive density</w:t>
+      </w:r>
+      <w:r>
+        <w:rPr>
+          <w:rFonts w:ascii="Futura Medium" w:hAnsi="Futura Medium" w:cs="Futura Medium"/>
+          <w:sz w:val="20"/>
+          <w:szCs w:val="20"/>
+          <w:lang w:val="en-US"/>
+        </w:rPr>
+        <w:t xml:space="preserve"> (</w:t>
+      </w:r>
+      <w:r>
+        <w:rPr>
+          <w:rFonts w:ascii="Futura Medium" w:hAnsi="Futura Medium" w:cs="Futura Medium"/>
+          <w:sz w:val="20"/>
+          <w:szCs w:val="20"/>
+          <w:lang w:val="en-US"/>
+        </w:rPr>
+        <w:t>LPD</w:t>
+      </w:r>
+      <w:r>
+        <w:t xml:space="preserve"> </w:t>
+      </w:r>
+      <w:r>
+        <w:rPr>
+          <w:rFonts w:ascii="Futura Medium" w:hAnsi="Futura Medium" w:cs="Futura Medium"/>
+          <w:sz w:val="20"/>
+          <w:szCs w:val="20"/>
+          <w:lang w:val="en-US"/>
+        </w:rPr>
+        <w:t>−</w:t>
+      </w:r>
+      <w:r>
+        <w:rPr>
+          <w:rFonts w:ascii="Futura Medium" w:hAnsi="Futura Medium" w:cs="Futura Medium"/>
+          <w:sz w:val="20"/>
+          <w:szCs w:val="20"/>
+          <w:lang w:val="en-US"/>
+        </w:rPr>
+        <w:t xml:space="preserve"> ELPD</w:t>
+      </w:r>
+      <w:r>
+        <w:rPr>
+          <w:rFonts w:ascii="Futura Medium" w:hAnsi="Futura Medium" w:cs="Futura Medium"/>
+          <w:sz w:val="20"/>
+          <w:szCs w:val="20"/>
+          <w:lang w:val="en-US"/>
+        </w:rPr>
         <w:t>)</w:t>
       </w:r>
       <w:r>
@@ -516,199 +679,7 @@
           <w:szCs w:val="20"/>
           <w:lang w:val="en-US"/>
         </w:rPr>
-        <w:t xml:space="preserve">, a measure of predictive </w:t>
-      </w:r>
-      <w:r>
-        <w:rPr>
-          <w:rFonts w:ascii="Futura Medium" w:hAnsi="Futura Medium" w:cs="Futura Medium"/>
-          <w:sz w:val="20"/>
-          <w:szCs w:val="20"/>
-          <w:lang w:val="en-US"/>
-        </w:rPr>
-        <w:t>accuracy</w:t>
-      </w:r>
-      <w:r>
-        <w:rPr>
-          <w:rFonts w:ascii="Futura Medium" w:hAnsi="Futura Medium" w:cs="Futura Medium"/>
-          <w:sz w:val="20"/>
-          <w:szCs w:val="20"/>
-          <w:lang w:val="en-US"/>
-        </w:rPr>
-        <w:t>,</w:t>
-      </w:r>
-      <w:r>
-        <w:rPr>
-          <w:rFonts w:ascii="Futura" w:hAnsi="Futura" w:cs="Futura"/>
-          <w:sz w:val="20"/>
-          <w:szCs w:val="20"/>
-          <w:lang w:val="en-US"/>
-        </w:rPr>
-        <w:t xml:space="preserve"> </w:t>
-      </w:r>
-      <w:r>
-        <w:rPr>
-          <w:rFonts w:ascii="Futura" w:hAnsi="Futura" w:cs="Futura"/>
-          <w:sz w:val="20"/>
-          <w:szCs w:val="20"/>
-          <w:lang w:val="en-US"/>
-        </w:rPr>
-        <w:t>ELPD</w:t>
-      </w:r>
-      <w:r>
-        <w:rPr>
-          <w:rFonts w:ascii="Futura" w:hAnsi="Futura" w:cs="Futura"/>
-          <w:sz w:val="20"/>
-          <w:szCs w:val="20"/>
-          <w:lang w:val="en-US"/>
-        </w:rPr>
-        <w:t xml:space="preserve"> </w:t>
-      </w:r>
-      <w:r>
-        <w:rPr>
-          <w:rFonts w:ascii="Futura" w:hAnsi="Futura" w:cs="Futura"/>
-          <w:sz w:val="20"/>
-          <w:szCs w:val="20"/>
-          <w:lang w:val="en-US"/>
-        </w:rPr>
-        <w:t>relative</w:t>
-      </w:r>
-      <w:r>
-        <w:rPr>
-          <w:rFonts w:ascii="Futura" w:hAnsi="Futura" w:cs="Futura"/>
-          <w:sz w:val="20"/>
-          <w:szCs w:val="20"/>
-          <w:lang w:val="en-US"/>
-        </w:rPr>
-        <w:t xml:space="preserve"> to the best performing model per study</w:t>
-      </w:r>
-      <w:r>
-        <w:rPr>
-          <w:rFonts w:ascii="Futura" w:hAnsi="Futura" w:cs="Futura"/>
-          <w:sz w:val="20"/>
-          <w:szCs w:val="20"/>
-          <w:lang w:val="en-US"/>
-        </w:rPr>
-        <w:t xml:space="preserve"> (</w:t>
-      </w:r>
-      <w:r>
-        <w:rPr>
-          <w:rFonts w:ascii="Futura" w:hAnsi="Futura" w:cs="Futura"/>
-          <w:sz w:val="20"/>
-          <w:szCs w:val="20"/>
-          <w:lang w:val="en-US"/>
-        </w:rPr>
-        <w:t>ΔELPD</w:t>
-      </w:r>
-      <w:r>
-        <w:rPr>
-          <w:rFonts w:ascii="Futura" w:hAnsi="Futura" w:cs="Futura"/>
-          <w:sz w:val="20"/>
-          <w:szCs w:val="20"/>
-          <w:lang w:val="en-US"/>
-        </w:rPr>
-        <w:t>)</w:t>
-      </w:r>
-      <w:r>
-        <w:rPr>
-          <w:rFonts w:ascii="Futura Medium" w:hAnsi="Futura Medium" w:cs="Futura Medium"/>
-          <w:sz w:val="20"/>
-          <w:szCs w:val="20"/>
-          <w:lang w:val="en-US"/>
-        </w:rPr>
-        <w:t xml:space="preserve">, and </w:t>
-      </w:r>
-      <w:r>
-        <w:rPr>
-          <w:rFonts w:ascii="Futura Medium" w:hAnsi="Futura Medium" w:cs="Futura Medium"/>
-          <w:sz w:val="20"/>
-          <w:szCs w:val="20"/>
-          <w:lang w:val="en-US"/>
-        </w:rPr>
-        <w:t>the</w:t>
-      </w:r>
-      <w:r>
-        <w:rPr>
-          <w:rFonts w:ascii="Futura Medium" w:hAnsi="Futura Medium" w:cs="Futura Medium"/>
-          <w:sz w:val="20"/>
-          <w:szCs w:val="20"/>
-          <w:lang w:val="en-US"/>
-        </w:rPr>
-        <w:t xml:space="preserve"> </w:t>
-      </w:r>
-      <w:r>
-        <w:rPr>
-          <w:rFonts w:ascii="Futura Medium" w:hAnsi="Futura Medium" w:cs="Futura Medium"/>
-          <w:sz w:val="20"/>
-          <w:szCs w:val="20"/>
-          <w:lang w:val="en-US"/>
-        </w:rPr>
-        <w:t>difference between ELPD and the log predictive density</w:t>
-      </w:r>
-      <w:r>
-        <w:rPr>
-          <w:rFonts w:ascii="Futura Medium" w:hAnsi="Futura Medium" w:cs="Futura Medium"/>
-          <w:sz w:val="20"/>
-          <w:szCs w:val="20"/>
-          <w:lang w:val="en-US"/>
-        </w:rPr>
-        <w:t xml:space="preserve"> (</w:t>
-      </w:r>
-      <w:r>
-        <w:rPr>
-          <w:rFonts w:ascii="Futura Medium" w:hAnsi="Futura Medium" w:cs="Futura Medium"/>
-          <w:sz w:val="20"/>
-          <w:szCs w:val="20"/>
-          <w:lang w:val="en-US"/>
-        </w:rPr>
-        <w:t>LPD</w:t>
-      </w:r>
-      <w:r>
-        <w:t xml:space="preserve"> </w:t>
-      </w:r>
-      <w:r>
-        <w:rPr>
-          <w:rFonts w:ascii="Futura Medium" w:hAnsi="Futura Medium" w:cs="Futura Medium"/>
-          <w:sz w:val="20"/>
-          <w:szCs w:val="20"/>
-          <w:lang w:val="en-US"/>
-        </w:rPr>
-        <w:t>−</w:t>
-      </w:r>
-      <w:r>
-        <w:rPr>
-          <w:rFonts w:ascii="Futura Medium" w:hAnsi="Futura Medium" w:cs="Futura Medium"/>
-          <w:sz w:val="20"/>
-          <w:szCs w:val="20"/>
-          <w:lang w:val="en-US"/>
-        </w:rPr>
-        <w:t xml:space="preserve"> ELPD</w:t>
-      </w:r>
-      <w:r>
-        <w:rPr>
-          <w:rFonts w:ascii="Futura Medium" w:hAnsi="Futura Medium" w:cs="Futura Medium"/>
-          <w:sz w:val="20"/>
-          <w:szCs w:val="20"/>
-          <w:lang w:val="en-US"/>
-        </w:rPr>
-        <w:t>)</w:t>
-      </w:r>
-      <w:r>
-        <w:rPr>
-          <w:rFonts w:ascii="Futura Medium" w:hAnsi="Futura Medium" w:cs="Futura Medium"/>
-          <w:sz w:val="20"/>
-          <w:szCs w:val="20"/>
-          <w:lang w:val="en-US"/>
-        </w:rPr>
-        <w:t xml:space="preserve">, a </w:t>
-      </w:r>
-      <w:r>
-        <w:rPr>
-          <w:rFonts w:ascii="Futura Medium" w:hAnsi="Futura Medium" w:cs="Futura Medium"/>
-          <w:sz w:val="20"/>
-          <w:szCs w:val="20"/>
-          <w:lang w:val="en-US"/>
-        </w:rPr>
-        <w:t>measure of overfitting</w:t>
+        <w:t>, a measure of overfitting</w:t>
       </w:r>
       <w:r>
         <w:rPr>
@@ -1103,7 +1074,7 @@
           <w:p>
             <w:pPr>
               <w:rPr>
-                <w:rFonts w:ascii="Futura Medium" w:hAnsi="Futura Medium" w:cs="Futura Medium" w:hint="cs"/>
+                <w:rFonts w:ascii="Futura Medium" w:hAnsi="Futura Medium" w:cs="Futura Medium"/>
                 <w:sz w:val="20"/>
                 <w:szCs w:val="20"/>
                 <w:lang w:val="en-US"/>
@@ -1126,7 +1097,7 @@
           <w:p>
             <w:pPr>
               <w:rPr>
-                <w:rFonts w:ascii="Futura Medium" w:hAnsi="Futura Medium" w:cs="Futura Medium" w:hint="cs"/>
+                <w:rFonts w:ascii="Futura Medium" w:hAnsi="Futura Medium" w:cs="Futura Medium"/>
                 <w:sz w:val="20"/>
                 <w:szCs w:val="20"/>
                 <w:lang w:val="en-US"/>
@@ -1149,7 +1120,7 @@
           <w:p>
             <w:pPr>
               <w:rPr>
-                <w:rFonts w:ascii="Futura Medium" w:hAnsi="Futura Medium" w:cs="Futura Medium" w:hint="cs"/>
+                <w:rFonts w:ascii="Futura Medium" w:hAnsi="Futura Medium" w:cs="Futura Medium"/>
                 <w:sz w:val="20"/>
                 <w:szCs w:val="20"/>
                 <w:lang w:val="en-US"/>
@@ -1172,7 +1143,7 @@
           <w:p>
             <w:pPr>
               <w:rPr>
-                <w:rFonts w:ascii="Futura Medium" w:hAnsi="Futura Medium" w:cs="Futura Medium" w:hint="cs"/>
+                <w:rFonts w:ascii="Futura Medium" w:hAnsi="Futura Medium" w:cs="Futura Medium"/>
                 <w:sz w:val="20"/>
                 <w:szCs w:val="20"/>
                 <w:lang w:val="en-US"/>
@@ -1195,7 +1166,7 @@
           <w:p>
             <w:pPr>
               <w:rPr>
-                <w:rFonts w:ascii="Futura Medium" w:hAnsi="Futura Medium" w:cs="Futura Medium" w:hint="cs"/>
+                <w:rFonts w:ascii="Futura Medium" w:hAnsi="Futura Medium" w:cs="Futura Medium"/>
                 <w:sz w:val="20"/>
                 <w:szCs w:val="20"/>
                 <w:lang w:val="en-US"/>
@@ -1244,7 +1215,7 @@
           <w:p>
             <w:pPr>
               <w:rPr>
-                <w:rFonts w:ascii="Futura Medium" w:hAnsi="Futura Medium" w:cs="Futura Medium" w:hint="cs"/>
+                <w:rFonts w:ascii="Futura Medium" w:hAnsi="Futura Medium" w:cs="Futura Medium"/>
                 <w:sz w:val="20"/>
                 <w:szCs w:val="20"/>
                 <w:lang w:val="en-US"/>
@@ -1267,7 +1238,7 @@
           <w:p>
             <w:pPr>
               <w:rPr>
-                <w:rFonts w:ascii="Futura Medium" w:hAnsi="Futura Medium" w:cs="Futura Medium" w:hint="cs"/>
+                <w:rFonts w:ascii="Futura Medium" w:hAnsi="Futura Medium" w:cs="Futura Medium"/>
                 <w:sz w:val="20"/>
                 <w:szCs w:val="20"/>
                 <w:lang w:val="en-US"/>
@@ -1290,7 +1261,7 @@
           <w:p>
             <w:pPr>
               <w:rPr>
-                <w:rFonts w:ascii="Futura Medium" w:hAnsi="Futura Medium" w:cs="Futura Medium" w:hint="cs"/>
+                <w:rFonts w:ascii="Futura Medium" w:hAnsi="Futura Medium" w:cs="Futura Medium"/>
                 <w:sz w:val="20"/>
                 <w:szCs w:val="20"/>
                 <w:lang w:val="en-US"/>
@@ -1313,7 +1284,7 @@
           <w:p>
             <w:pPr>
               <w:rPr>
-                <w:rFonts w:ascii="Futura Medium" w:hAnsi="Futura Medium" w:cs="Futura Medium" w:hint="cs"/>
+                <w:rFonts w:ascii="Futura Medium" w:hAnsi="Futura Medium" w:cs="Futura Medium"/>
                 <w:sz w:val="20"/>
                 <w:szCs w:val="20"/>
                 <w:lang w:val="en-US"/>
@@ -1345,7 +1316,7 @@
           <w:p>
             <w:pPr>
               <w:rPr>
-                <w:rFonts w:ascii="Futura Medium" w:hAnsi="Futura Medium" w:cs="Futura Medium" w:hint="cs"/>
+                <w:rFonts w:ascii="Futura Medium" w:hAnsi="Futura Medium" w:cs="Futura Medium"/>
                 <w:sz w:val="20"/>
                 <w:szCs w:val="20"/>
                 <w:lang w:val="en-US"/>
@@ -1400,7 +1371,7 @@
           <w:p>
             <w:pPr>
               <w:rPr>
-                <w:rFonts w:ascii="Futura Medium" w:hAnsi="Futura Medium" w:cs="Futura Medium" w:hint="cs"/>
+                <w:rFonts w:ascii="Futura Medium" w:hAnsi="Futura Medium" w:cs="Futura Medium"/>
                 <w:sz w:val="20"/>
                 <w:szCs w:val="20"/>
                 <w:lang w:val="en-US"/>
@@ -1426,7 +1397,7 @@
           <w:p>
             <w:pPr>
               <w:rPr>
-                <w:rFonts w:ascii="Futura Medium" w:hAnsi="Futura Medium" w:cs="Futura Medium" w:hint="cs"/>
+                <w:rFonts w:ascii="Futura Medium" w:hAnsi="Futura Medium" w:cs="Futura Medium"/>
                 <w:sz w:val="20"/>
                 <w:szCs w:val="20"/>
                 <w:lang w:val="en-US"/>
@@ -1452,7 +1423,7 @@
           <w:p>
             <w:pPr>
               <w:rPr>
-                <w:rFonts w:ascii="Futura Medium" w:hAnsi="Futura Medium" w:cs="Futura Medium" w:hint="cs"/>
+                <w:rFonts w:ascii="Futura Medium" w:hAnsi="Futura Medium" w:cs="Futura Medium"/>
                 <w:sz w:val="20"/>
                 <w:szCs w:val="20"/>
                 <w:lang w:val="en-US"/>
@@ -1478,7 +1449,7 @@
           <w:p>
             <w:pPr>
               <w:rPr>
-                <w:rFonts w:ascii="Futura Medium" w:hAnsi="Futura Medium" w:cs="Futura Medium" w:hint="cs"/>
+                <w:rFonts w:ascii="Futura Medium" w:hAnsi="Futura Medium" w:cs="Futura Medium"/>
                 <w:sz w:val="20"/>
                 <w:szCs w:val="20"/>
                 <w:lang w:val="en-US"/>
@@ -1513,7 +1484,7 @@
           <w:p>
             <w:pPr>
               <w:rPr>
-                <w:rFonts w:ascii="Futura Medium" w:hAnsi="Futura Medium" w:cs="Futura Medium" w:hint="cs"/>
+                <w:rFonts w:ascii="Futura Medium" w:hAnsi="Futura Medium" w:cs="Futura Medium"/>
                 <w:sz w:val="20"/>
                 <w:szCs w:val="20"/>
                 <w:lang w:val="en-US"/>
@@ -1612,7 +1583,7 @@
           <w:p>
             <w:pPr>
               <w:rPr>
-                <w:rFonts w:ascii="Futura Medium" w:hAnsi="Futura Medium" w:cs="Futura Medium" w:hint="cs"/>
+                <w:rFonts w:ascii="Futura Medium" w:hAnsi="Futura Medium" w:cs="Futura Medium"/>
                 <w:sz w:val="20"/>
                 <w:szCs w:val="20"/>
                 <w:lang w:val="en-US"/>
@@ -1635,7 +1606,7 @@
           <w:p>
             <w:pPr>
               <w:rPr>
-                <w:rFonts w:ascii="Futura Medium" w:hAnsi="Futura Medium" w:cs="Futura Medium" w:hint="cs"/>
+                <w:rFonts w:ascii="Futura Medium" w:hAnsi="Futura Medium" w:cs="Futura Medium"/>
                 <w:sz w:val="20"/>
                 <w:szCs w:val="20"/>
                 <w:lang w:val="en-US"/>
@@ -1658,7 +1629,7 @@
           <w:p>
             <w:pPr>
               <w:rPr>
-                <w:rFonts w:ascii="Futura Medium" w:hAnsi="Futura Medium" w:cs="Futura Medium" w:hint="cs"/>
+                <w:rFonts w:ascii="Futura Medium" w:hAnsi="Futura Medium" w:cs="Futura Medium"/>
                 <w:sz w:val="20"/>
                 <w:szCs w:val="20"/>
                 <w:lang w:val="en-US"/>
@@ -1681,7 +1652,7 @@
           <w:p>
             <w:pPr>
               <w:rPr>
-                <w:rFonts w:ascii="Futura Medium" w:hAnsi="Futura Medium" w:cs="Futura Medium" w:hint="cs"/>
+                <w:rFonts w:ascii="Futura Medium" w:hAnsi="Futura Medium" w:cs="Futura Medium"/>
                 <w:sz w:val="20"/>
                 <w:szCs w:val="20"/>
                 <w:lang w:val="en-US"/>
@@ -1713,7 +1684,7 @@
           <w:p>
             <w:pPr>
               <w:rPr>
-                <w:rFonts w:ascii="Futura Medium" w:hAnsi="Futura Medium" w:cs="Futura Medium" w:hint="cs"/>
+                <w:rFonts w:ascii="Futura Medium" w:hAnsi="Futura Medium" w:cs="Futura Medium"/>
                 <w:sz w:val="20"/>
                 <w:szCs w:val="20"/>
                 <w:lang w:val="en-US"/>
@@ -1762,7 +1733,7 @@
           <w:p>
             <w:pPr>
               <w:rPr>
-                <w:rFonts w:ascii="Futura Medium" w:hAnsi="Futura Medium" w:cs="Futura Medium" w:hint="cs"/>
+                <w:rFonts w:ascii="Futura Medium" w:hAnsi="Futura Medium" w:cs="Futura Medium"/>
                 <w:sz w:val="20"/>
                 <w:szCs w:val="20"/>
                 <w:lang w:val="en-US"/>
@@ -1785,7 +1756,7 @@
           <w:p>
             <w:pPr>
               <w:rPr>
-                <w:rFonts w:ascii="Futura Medium" w:hAnsi="Futura Medium" w:cs="Futura Medium" w:hint="cs"/>
+                <w:rFonts w:ascii="Futura Medium" w:hAnsi="Futura Medium" w:cs="Futura Medium"/>
                 <w:sz w:val="20"/>
                 <w:szCs w:val="20"/>
                 <w:lang w:val="en-US"/>
@@ -1808,7 +1779,7 @@
           <w:p>
             <w:pPr>
               <w:rPr>
-                <w:rFonts w:ascii="Futura Medium" w:hAnsi="Futura Medium" w:cs="Futura Medium" w:hint="cs"/>
+                <w:rFonts w:ascii="Futura Medium" w:hAnsi="Futura Medium" w:cs="Futura Medium"/>
                 <w:sz w:val="20"/>
                 <w:szCs w:val="20"/>
                 <w:lang w:val="en-US"/>
@@ -1831,7 +1802,7 @@
           <w:p>
             <w:pPr>
               <w:rPr>
-                <w:rFonts w:ascii="Futura Medium" w:hAnsi="Futura Medium" w:cs="Futura Medium" w:hint="cs"/>
+                <w:rFonts w:ascii="Futura Medium" w:hAnsi="Futura Medium" w:cs="Futura Medium"/>
                 <w:sz w:val="20"/>
                 <w:szCs w:val="20"/>
                 <w:lang w:val="en-US"/>
@@ -1863,7 +1834,7 @@
           <w:p>
             <w:pPr>
               <w:rPr>
-                <w:rFonts w:ascii="Futura Medium" w:hAnsi="Futura Medium" w:cs="Futura Medium" w:hint="cs"/>
+                <w:rFonts w:ascii="Futura Medium" w:hAnsi="Futura Medium" w:cs="Futura Medium"/>
                 <w:sz w:val="20"/>
                 <w:szCs w:val="20"/>
                 <w:lang w:val="en-US"/>
@@ -1918,7 +1889,7 @@
           <w:p>
             <w:pPr>
               <w:rPr>
-                <w:rFonts w:ascii="Futura Medium" w:hAnsi="Futura Medium" w:cs="Futura Medium" w:hint="cs"/>
+                <w:rFonts w:ascii="Futura Medium" w:hAnsi="Futura Medium" w:cs="Futura Medium"/>
                 <w:sz w:val="20"/>
                 <w:szCs w:val="20"/>
                 <w:lang w:val="en-US"/>
@@ -1944,7 +1915,7 @@
           <w:p>
             <w:pPr>
               <w:rPr>
-                <w:rFonts w:ascii="Futura Medium" w:hAnsi="Futura Medium" w:cs="Futura Medium" w:hint="cs"/>
+                <w:rFonts w:ascii="Futura Medium" w:hAnsi="Futura Medium" w:cs="Futura Medium"/>
                 <w:sz w:val="20"/>
                 <w:szCs w:val="20"/>
                 <w:lang w:val="en-US"/>
@@ -1970,7 +1941,7 @@
           <w:p>
             <w:pPr>
               <w:rPr>
-                <w:rFonts w:ascii="Futura Medium" w:hAnsi="Futura Medium" w:cs="Futura Medium" w:hint="cs"/>
+                <w:rFonts w:ascii="Futura Medium" w:hAnsi="Futura Medium" w:cs="Futura Medium"/>
                 <w:sz w:val="20"/>
                 <w:szCs w:val="20"/>
                 <w:lang w:val="en-US"/>
@@ -1996,7 +1967,7 @@
           <w:p>
             <w:pPr>
               <w:rPr>
-                <w:rFonts w:ascii="Futura Medium" w:hAnsi="Futura Medium" w:cs="Futura Medium" w:hint="cs"/>
+                <w:rFonts w:ascii="Futura Medium" w:hAnsi="Futura Medium" w:cs="Futura Medium"/>
                 <w:sz w:val="20"/>
                 <w:szCs w:val="20"/>
                 <w:lang w:val="en-US"/>
@@ -2022,7 +1993,7 @@
           <w:p>
             <w:pPr>
               <w:rPr>
-                <w:rFonts w:ascii="Futura Medium" w:hAnsi="Futura Medium" w:cs="Futura Medium" w:hint="cs"/>
+                <w:rFonts w:ascii="Futura Medium" w:hAnsi="Futura Medium" w:cs="Futura Medium"/>
                 <w:sz w:val="20"/>
                 <w:szCs w:val="20"/>
                 <w:lang w:val="en-US"/>
@@ -2491,7 +2462,7 @@
           <w:p>
             <w:pPr>
               <w:rPr>
-                <w:rFonts w:ascii="Futura Medium" w:hAnsi="Futura Medium" w:cs="Futura Medium" w:hint="cs"/>
+                <w:rFonts w:ascii="Futura Medium" w:hAnsi="Futura Medium" w:cs="Futura Medium"/>
                 <w:sz w:val="20"/>
                 <w:szCs w:val="20"/>
                 <w:lang w:val="en-US"/>
@@ -2514,7 +2485,7 @@
           <w:p>
             <w:pPr>
               <w:rPr>
-                <w:rFonts w:ascii="Futura Medium" w:hAnsi="Futura Medium" w:cs="Futura Medium" w:hint="cs"/>
+                <w:rFonts w:ascii="Futura Medium" w:hAnsi="Futura Medium" w:cs="Futura Medium"/>
                 <w:sz w:val="20"/>
                 <w:szCs w:val="20"/>
                 <w:lang w:val="en-US"/>
@@ -2537,7 +2508,7 @@
           <w:p>
             <w:pPr>
               <w:rPr>
-                <w:rFonts w:ascii="Futura Medium" w:hAnsi="Futura Medium" w:cs="Futura Medium" w:hint="cs"/>
+                <w:rFonts w:ascii="Futura Medium" w:hAnsi="Futura Medium" w:cs="Futura Medium"/>
                 <w:sz w:val="20"/>
                 <w:szCs w:val="20"/>
                 <w:lang w:val="en-US"/>
@@ -2569,7 +2540,7 @@
           <w:p>
             <w:pPr>
               <w:rPr>
-                <w:rFonts w:ascii="Futura Medium" w:hAnsi="Futura Medium" w:cs="Futura Medium" w:hint="cs"/>
+                <w:rFonts w:ascii="Futura Medium" w:hAnsi="Futura Medium" w:cs="Futura Medium"/>
                 <w:sz w:val="20"/>
                 <w:szCs w:val="20"/>
                 <w:lang w:val="en-US"/>
@@ -2601,7 +2572,7 @@
           <w:p>
             <w:pPr>
               <w:rPr>
-                <w:rFonts w:ascii="Futura Medium" w:hAnsi="Futura Medium" w:cs="Futura Medium" w:hint="cs"/>
+                <w:rFonts w:ascii="Futura Medium" w:hAnsi="Futura Medium" w:cs="Futura Medium"/>
                 <w:sz w:val="20"/>
                 <w:szCs w:val="20"/>
                 <w:lang w:val="en-US"/>
@@ -2650,7 +2621,7 @@
           <w:p>
             <w:pPr>
               <w:rPr>
-                <w:rFonts w:ascii="Futura Medium" w:hAnsi="Futura Medium" w:cs="Futura Medium" w:hint="cs"/>
+                <w:rFonts w:ascii="Futura Medium" w:hAnsi="Futura Medium" w:cs="Futura Medium"/>
                 <w:sz w:val="20"/>
                 <w:szCs w:val="20"/>
                 <w:lang w:val="en-US"/>
@@ -2673,7 +2644,7 @@
           <w:p>
             <w:pPr>
               <w:rPr>
-                <w:rFonts w:ascii="Futura Medium" w:hAnsi="Futura Medium" w:cs="Futura Medium" w:hint="cs"/>
+                <w:rFonts w:ascii="Futura Medium" w:hAnsi="Futura Medium" w:cs="Futura Medium"/>
                 <w:sz w:val="20"/>
                 <w:szCs w:val="20"/>
                 <w:lang w:val="en-US"/>
@@ -2696,7 +2667,7 @@
           <w:p>
             <w:pPr>
               <w:rPr>
-                <w:rFonts w:ascii="Futura Medium" w:hAnsi="Futura Medium" w:cs="Futura Medium" w:hint="cs"/>
+                <w:rFonts w:ascii="Futura Medium" w:hAnsi="Futura Medium" w:cs="Futura Medium"/>
                 <w:sz w:val="20"/>
                 <w:szCs w:val="20"/>
                 <w:lang w:val="en-US"/>
@@ -2728,7 +2699,7 @@
           <w:p>
             <w:pPr>
               <w:rPr>
-                <w:rFonts w:ascii="Futura Medium" w:hAnsi="Futura Medium" w:cs="Futura Medium" w:hint="cs"/>
+                <w:rFonts w:ascii="Futura Medium" w:hAnsi="Futura Medium" w:cs="Futura Medium"/>
                 <w:sz w:val="20"/>
                 <w:szCs w:val="20"/>
                 <w:lang w:val="en-US"/>
@@ -2760,7 +2731,7 @@
           <w:p>
             <w:pPr>
               <w:rPr>
-                <w:rFonts w:ascii="Futura Medium" w:hAnsi="Futura Medium" w:cs="Futura Medium" w:hint="cs"/>
+                <w:rFonts w:ascii="Futura Medium" w:hAnsi="Futura Medium" w:cs="Futura Medium"/>
                 <w:sz w:val="20"/>
                 <w:szCs w:val="20"/>
                 <w:lang w:val="en-US"/>
@@ -2809,7 +2780,7 @@
           <w:p>
             <w:pPr>
               <w:rPr>
-                <w:rFonts w:ascii="Futura Medium" w:hAnsi="Futura Medium" w:cs="Futura Medium" w:hint="cs"/>
+                <w:rFonts w:ascii="Futura Medium" w:hAnsi="Futura Medium" w:cs="Futura Medium"/>
                 <w:sz w:val="20"/>
                 <w:szCs w:val="20"/>
                 <w:lang w:val="en-US"/>
@@ -2832,7 +2803,7 @@
           <w:p>
             <w:pPr>
               <w:rPr>
-                <w:rFonts w:ascii="Futura Medium" w:hAnsi="Futura Medium" w:cs="Futura Medium" w:hint="cs"/>
+                <w:rFonts w:ascii="Futura Medium" w:hAnsi="Futura Medium" w:cs="Futura Medium"/>
                 <w:sz w:val="20"/>
                 <w:szCs w:val="20"/>
                 <w:lang w:val="en-US"/>
@@ -2855,7 +2826,7 @@
           <w:p>
             <w:pPr>
               <w:rPr>
-                <w:rFonts w:ascii="Futura Medium" w:hAnsi="Futura Medium" w:cs="Futura Medium" w:hint="cs"/>
+                <w:rFonts w:ascii="Futura Medium" w:hAnsi="Futura Medium" w:cs="Futura Medium"/>
                 <w:sz w:val="20"/>
                 <w:szCs w:val="20"/>
                 <w:lang w:val="en-US"/>
@@ -2887,7 +2858,7 @@
           <w:p>
             <w:pPr>
               <w:rPr>
-                <w:rFonts w:ascii="Futura Medium" w:hAnsi="Futura Medium" w:cs="Futura Medium" w:hint="cs"/>
+                <w:rFonts w:ascii="Futura Medium" w:hAnsi="Futura Medium" w:cs="Futura Medium"/>
                 <w:sz w:val="20"/>
                 <w:szCs w:val="20"/>
                 <w:lang w:val="en-US"/>
@@ -2919,7 +2890,7 @@
           <w:p>
             <w:pPr>
               <w:rPr>
-                <w:rFonts w:ascii="Futura Medium" w:hAnsi="Futura Medium" w:cs="Futura Medium" w:hint="cs"/>
+                <w:rFonts w:ascii="Futura Medium" w:hAnsi="Futura Medium" w:cs="Futura Medium"/>
                 <w:sz w:val="20"/>
                 <w:szCs w:val="20"/>
                 <w:lang w:val="en-US"/>
@@ -2974,7 +2945,7 @@
           <w:p>
             <w:pPr>
               <w:rPr>
-                <w:rFonts w:ascii="Futura Medium" w:hAnsi="Futura Medium" w:cs="Futura Medium" w:hint="cs"/>
+                <w:rFonts w:ascii="Futura Medium" w:hAnsi="Futura Medium" w:cs="Futura Medium"/>
                 <w:sz w:val="20"/>
                 <w:szCs w:val="20"/>
               </w:rPr>
@@ -2999,7 +2970,7 @@
           <w:p>
             <w:pPr>
               <w:rPr>
-                <w:rFonts w:ascii="Futura Medium" w:hAnsi="Futura Medium" w:cs="Futura Medium" w:hint="cs"/>
+                <w:rFonts w:ascii="Futura Medium" w:hAnsi="Futura Medium" w:cs="Futura Medium"/>
                 <w:sz w:val="20"/>
                 <w:szCs w:val="20"/>
               </w:rPr>
@@ -3024,7 +2995,7 @@
           <w:p>
             <w:pPr>
               <w:rPr>
-                <w:rFonts w:ascii="Futura Medium" w:hAnsi="Futura Medium" w:cs="Futura Medium" w:hint="cs"/>
+                <w:rFonts w:ascii="Futura Medium" w:hAnsi="Futura Medium" w:cs="Futura Medium"/>
                 <w:sz w:val="20"/>
                 <w:szCs w:val="20"/>
               </w:rPr>
@@ -3049,7 +3020,7 @@
           <w:p>
             <w:pPr>
               <w:rPr>
-                <w:rFonts w:ascii="Futura Medium" w:hAnsi="Futura Medium" w:cs="Futura Medium" w:hint="cs"/>
+                <w:rFonts w:ascii="Futura Medium" w:hAnsi="Futura Medium" w:cs="Futura Medium"/>
                 <w:sz w:val="20"/>
                 <w:szCs w:val="20"/>
                 <w:lang w:val="en-US"/>
@@ -3075,7 +3046,7 @@
           <w:p>
             <w:pPr>
               <w:rPr>
-                <w:rFonts w:ascii="Futura Medium" w:hAnsi="Futura Medium" w:cs="Futura Medium" w:hint="cs"/>
+                <w:rFonts w:ascii="Futura Medium" w:hAnsi="Futura Medium" w:cs="Futura Medium"/>
                 <w:sz w:val="20"/>
                 <w:szCs w:val="20"/>
               </w:rPr>
@@ -3173,7 +3144,7 @@
           <w:p>
             <w:pPr>
               <w:rPr>
-                <w:rFonts w:ascii="Futura Medium" w:hAnsi="Futura Medium" w:cs="Futura Medium" w:hint="cs"/>
+                <w:rFonts w:ascii="Futura Medium" w:hAnsi="Futura Medium" w:cs="Futura Medium"/>
                 <w:sz w:val="20"/>
                 <w:szCs w:val="20"/>
                 <w:lang w:val="en-US"/>
@@ -3196,7 +3167,7 @@
           <w:p>
             <w:pPr>
               <w:rPr>
-                <w:rFonts w:ascii="Futura Medium" w:hAnsi="Futura Medium" w:cs="Futura Medium" w:hint="cs"/>
+                <w:rFonts w:ascii="Futura Medium" w:hAnsi="Futura Medium" w:cs="Futura Medium"/>
                 <w:sz w:val="20"/>
                 <w:szCs w:val="20"/>
                 <w:lang w:val="en-US"/>
@@ -3219,7 +3190,7 @@
           <w:p>
             <w:pPr>
               <w:rPr>
-                <w:rFonts w:ascii="Futura Medium" w:hAnsi="Futura Medium" w:cs="Futura Medium" w:hint="cs"/>
+                <w:rFonts w:ascii="Futura Medium" w:hAnsi="Futura Medium" w:cs="Futura Medium"/>
                 <w:sz w:val="20"/>
                 <w:szCs w:val="20"/>
                 <w:lang w:val="en-US"/>
@@ -3242,7 +3213,7 @@
           <w:p>
             <w:pPr>
               <w:rPr>
-                <w:rFonts w:ascii="Futura Medium" w:hAnsi="Futura Medium" w:cs="Futura Medium" w:hint="cs"/>
+                <w:rFonts w:ascii="Futura Medium" w:hAnsi="Futura Medium" w:cs="Futura Medium"/>
                 <w:sz w:val="20"/>
                 <w:szCs w:val="20"/>
                 <w:lang w:val="en-US"/>
@@ -3274,7 +3245,7 @@
           <w:p>
             <w:pPr>
               <w:rPr>
-                <w:rFonts w:ascii="Futura Medium" w:hAnsi="Futura Medium" w:cs="Futura Medium" w:hint="cs"/>
+                <w:rFonts w:ascii="Futura Medium" w:hAnsi="Futura Medium" w:cs="Futura Medium"/>
                 <w:sz w:val="20"/>
                 <w:szCs w:val="20"/>
                 <w:lang w:val="en-US"/>
@@ -3323,7 +3294,7 @@
           <w:p>
             <w:pPr>
               <w:rPr>
-                <w:rFonts w:ascii="Futura Medium" w:hAnsi="Futura Medium" w:cs="Futura Medium" w:hint="cs"/>
+                <w:rFonts w:ascii="Futura Medium" w:hAnsi="Futura Medium" w:cs="Futura Medium"/>
                 <w:sz w:val="20"/>
                 <w:szCs w:val="20"/>
                 <w:lang w:val="en-US"/>
@@ -3346,7 +3317,7 @@
           <w:p>
             <w:pPr>
               <w:rPr>
-                <w:rFonts w:ascii="Futura Medium" w:hAnsi="Futura Medium" w:cs="Futura Medium" w:hint="cs"/>
+                <w:rFonts w:ascii="Futura Medium" w:hAnsi="Futura Medium" w:cs="Futura Medium"/>
                 <w:sz w:val="20"/>
                 <w:szCs w:val="20"/>
                 <w:lang w:val="en-US"/>
@@ -3369,7 +3340,7 @@
           <w:p>
             <w:pPr>
               <w:rPr>
-                <w:rFonts w:ascii="Futura Medium" w:hAnsi="Futura Medium" w:cs="Futura Medium" w:hint="cs"/>
+                <w:rFonts w:ascii="Futura Medium" w:hAnsi="Futura Medium" w:cs="Futura Medium"/>
                 <w:sz w:val="20"/>
                 <w:szCs w:val="20"/>
                 <w:lang w:val="en-US"/>
@@ -3392,7 +3363,7 @@
           <w:p>
             <w:pPr>
               <w:rPr>
-                <w:rFonts w:ascii="Futura Medium" w:hAnsi="Futura Medium" w:cs="Futura Medium" w:hint="cs"/>
+                <w:rFonts w:ascii="Futura Medium" w:hAnsi="Futura Medium" w:cs="Futura Medium"/>
                 <w:sz w:val="20"/>
                 <w:szCs w:val="20"/>
                 <w:lang w:val="en-US"/>
@@ -3415,7 +3386,7 @@
           <w:p>
             <w:pPr>
               <w:rPr>
-                <w:rFonts w:ascii="Futura Medium" w:hAnsi="Futura Medium" w:cs="Futura Medium" w:hint="cs"/>
+                <w:rFonts w:ascii="Futura Medium" w:hAnsi="Futura Medium" w:cs="Futura Medium"/>
                 <w:sz w:val="20"/>
                 <w:szCs w:val="20"/>
                 <w:lang w:val="en-US"/>
@@ -3464,7 +3435,7 @@
           <w:p>
             <w:pPr>
               <w:rPr>
-                <w:rFonts w:ascii="Futura Medium" w:hAnsi="Futura Medium" w:cs="Futura Medium" w:hint="cs"/>
+                <w:rFonts w:ascii="Futura Medium" w:hAnsi="Futura Medium" w:cs="Futura Medium"/>
                 <w:sz w:val="20"/>
                 <w:szCs w:val="20"/>
                 <w:lang w:val="en-US"/>
@@ -3487,7 +3458,7 @@
           <w:p>
             <w:pPr>
               <w:rPr>
-                <w:rFonts w:ascii="Futura Medium" w:hAnsi="Futura Medium" w:cs="Futura Medium" w:hint="cs"/>
+                <w:rFonts w:ascii="Futura Medium" w:hAnsi="Futura Medium" w:cs="Futura Medium"/>
                 <w:sz w:val="20"/>
                 <w:szCs w:val="20"/>
                 <w:lang w:val="en-US"/>
@@ -3510,7 +3481,7 @@
           <w:p>
             <w:pPr>
               <w:rPr>
-                <w:rFonts w:ascii="Futura Medium" w:hAnsi="Futura Medium" w:cs="Futura Medium" w:hint="cs"/>
+                <w:rFonts w:ascii="Futura Medium" w:hAnsi="Futura Medium" w:cs="Futura Medium"/>
                 <w:sz w:val="20"/>
                 <w:szCs w:val="20"/>
                 <w:lang w:val="en-US"/>
@@ -3533,7 +3504,7 @@
           <w:p>
             <w:pPr>
               <w:rPr>
-                <w:rFonts w:ascii="Futura Medium" w:hAnsi="Futura Medium" w:cs="Futura Medium" w:hint="cs"/>
+                <w:rFonts w:ascii="Futura Medium" w:hAnsi="Futura Medium" w:cs="Futura Medium"/>
                 <w:sz w:val="20"/>
                 <w:szCs w:val="20"/>
                 <w:lang w:val="en-US"/>
@@ -3565,7 +3536,7 @@
           <w:p>
             <w:pPr>
               <w:rPr>
-                <w:rFonts w:ascii="Futura Medium" w:hAnsi="Futura Medium" w:cs="Futura Medium" w:hint="cs"/>
+                <w:rFonts w:ascii="Futura Medium" w:hAnsi="Futura Medium" w:cs="Futura Medium"/>
                 <w:sz w:val="20"/>
                 <w:szCs w:val="20"/>
                 <w:lang w:val="en-US"/>
@@ -3620,7 +3591,7 @@
           <w:p>
             <w:pPr>
               <w:rPr>
-                <w:rFonts w:ascii="Futura Medium" w:hAnsi="Futura Medium" w:cs="Futura Medium" w:hint="cs"/>
+                <w:rFonts w:ascii="Futura Medium" w:hAnsi="Futura Medium" w:cs="Futura Medium"/>
                 <w:sz w:val="20"/>
                 <w:szCs w:val="20"/>
               </w:rPr>
@@ -3645,7 +3616,7 @@
           <w:p>
             <w:pPr>
               <w:rPr>
-                <w:rFonts w:ascii="Futura Medium" w:hAnsi="Futura Medium" w:cs="Futura Medium" w:hint="cs"/>
+                <w:rFonts w:ascii="Futura Medium" w:hAnsi="Futura Medium" w:cs="Futura Medium"/>
                 <w:sz w:val="20"/>
                 <w:szCs w:val="20"/>
               </w:rPr>
@@ -3670,7 +3641,7 @@
           <w:p>
             <w:pPr>
               <w:rPr>
-                <w:rFonts w:ascii="Futura Medium" w:hAnsi="Futura Medium" w:cs="Futura Medium" w:hint="cs"/>
+                <w:rFonts w:ascii="Futura Medium" w:hAnsi="Futura Medium" w:cs="Futura Medium"/>
                 <w:sz w:val="20"/>
                 <w:szCs w:val="20"/>
               </w:rPr>
@@ -3695,7 +3666,7 @@
           <w:p>
             <w:pPr>
               <w:rPr>
-                <w:rFonts w:ascii="Futura Medium" w:hAnsi="Futura Medium" w:cs="Futura Medium" w:hint="cs"/>
+                <w:rFonts w:ascii="Futura Medium" w:hAnsi="Futura Medium" w:cs="Futura Medium"/>
                 <w:sz w:val="20"/>
                 <w:szCs w:val="20"/>
               </w:rPr>
@@ -3729,7 +3700,7 @@
           <w:p>
             <w:pPr>
               <w:rPr>
-                <w:rFonts w:ascii="Futura Medium" w:hAnsi="Futura Medium" w:cs="Futura Medium" w:hint="cs"/>
+                <w:rFonts w:ascii="Futura Medium" w:hAnsi="Futura Medium" w:cs="Futura Medium"/>
                 <w:sz w:val="20"/>
                 <w:szCs w:val="20"/>
               </w:rPr>
@@ -4256,7 +4227,7 @@
           <w:p>
             <w:pPr>
               <w:rPr>
-                <w:rFonts w:ascii="Futura Medium" w:hAnsi="Futura Medium" w:cs="Futura Medium" w:hint="cs"/>
+                <w:rFonts w:ascii="Futura Medium" w:hAnsi="Futura Medium" w:cs="Futura Medium"/>
                 <w:sz w:val="20"/>
                 <w:szCs w:val="20"/>
               </w:rPr>
@@ -4340,7 +4311,7 @@
           <w:p>
             <w:pPr>
               <w:rPr>
-                <w:rFonts w:ascii="Futura Medium" w:hAnsi="Futura Medium" w:cs="Futura Medium" w:hint="cs"/>
+                <w:rFonts w:ascii="Futura Medium" w:hAnsi="Futura Medium" w:cs="Futura Medium"/>
                 <w:sz w:val="20"/>
                 <w:szCs w:val="20"/>
               </w:rPr>
@@ -4354,7 +4325,7 @@
           <w:p>
             <w:pPr>
               <w:rPr>
-                <w:rFonts w:ascii="Futura Medium" w:hAnsi="Futura Medium" w:cs="Futura Medium" w:hint="cs"/>
+                <w:rFonts w:ascii="Futura Medium" w:hAnsi="Futura Medium" w:cs="Futura Medium"/>
                 <w:sz w:val="20"/>
                 <w:szCs w:val="20"/>
               </w:rPr>
@@ -4368,7 +4339,7 @@
           <w:p>
             <w:pPr>
               <w:rPr>
-                <w:rFonts w:ascii="Futura Medium" w:hAnsi="Futura Medium" w:cs="Futura Medium" w:hint="cs"/>
+                <w:rFonts w:ascii="Futura Medium" w:hAnsi="Futura Medium" w:cs="Futura Medium"/>
                 <w:sz w:val="20"/>
                 <w:szCs w:val="20"/>
               </w:rPr>
@@ -4397,7 +4368,7 @@
           <w:p>
             <w:pPr>
               <w:rPr>
-                <w:rFonts w:ascii="Futura Medium" w:hAnsi="Futura Medium" w:cs="Futura Medium" w:hint="cs"/>
+                <w:rFonts w:ascii="Futura Medium" w:hAnsi="Futura Medium" w:cs="Futura Medium"/>
                 <w:sz w:val="20"/>
                 <w:szCs w:val="20"/>
               </w:rPr>
@@ -4444,7 +4415,7 @@
           <w:p>
             <w:pPr>
               <w:rPr>
-                <w:rFonts w:ascii="Futura Medium" w:hAnsi="Futura Medium" w:cs="Futura Medium" w:hint="cs"/>
+                <w:rFonts w:ascii="Futura Medium" w:hAnsi="Futura Medium" w:cs="Futura Medium"/>
                 <w:sz w:val="20"/>
                 <w:szCs w:val="20"/>
                 <w:lang w:val="en-US"/>
@@ -4467,7 +4438,7 @@
           <w:p>
             <w:pPr>
               <w:rPr>
-                <w:rFonts w:ascii="Futura Medium" w:hAnsi="Futura Medium" w:cs="Futura Medium" w:hint="cs"/>
+                <w:rFonts w:ascii="Futura Medium" w:hAnsi="Futura Medium" w:cs="Futura Medium"/>
                 <w:sz w:val="20"/>
                 <w:szCs w:val="20"/>
                 <w:lang w:val="en-US"/>
@@ -4490,7 +4461,7 @@
           <w:p>
             <w:pPr>
               <w:rPr>
-                <w:rFonts w:ascii="Futura Medium" w:hAnsi="Futura Medium" w:cs="Futura Medium" w:hint="cs"/>
+                <w:rFonts w:ascii="Futura Medium" w:hAnsi="Futura Medium" w:cs="Futura Medium"/>
                 <w:sz w:val="20"/>
                 <w:szCs w:val="20"/>
                 <w:lang w:val="en-US"/>
@@ -4513,7 +4484,7 @@
           <w:p>
             <w:pPr>
               <w:rPr>
-                <w:rFonts w:ascii="Futura Medium" w:hAnsi="Futura Medium" w:cs="Futura Medium" w:hint="cs"/>
+                <w:rFonts w:ascii="Futura Medium" w:hAnsi="Futura Medium" w:cs="Futura Medium"/>
                 <w:sz w:val="20"/>
                 <w:szCs w:val="20"/>
                 <w:lang w:val="en-US"/>
@@ -4545,7 +4516,7 @@
           <w:p>
             <w:pPr>
               <w:rPr>
-                <w:rFonts w:ascii="Futura Medium" w:hAnsi="Futura Medium" w:cs="Futura Medium" w:hint="cs"/>
+                <w:rFonts w:ascii="Futura Medium" w:hAnsi="Futura Medium" w:cs="Futura Medium"/>
                 <w:sz w:val="20"/>
                 <w:szCs w:val="20"/>
                 <w:lang w:val="en-US"/>
@@ -4603,7 +4574,7 @@
           <w:p>
             <w:pPr>
               <w:rPr>
-                <w:rFonts w:ascii="Futura Medium" w:hAnsi="Futura Medium" w:cs="Futura Medium" w:hint="cs"/>
+                <w:rFonts w:ascii="Futura Medium" w:hAnsi="Futura Medium" w:cs="Futura Medium"/>
                 <w:sz w:val="20"/>
                 <w:szCs w:val="20"/>
                 <w:lang w:val="en-US"/>
@@ -4626,7 +4597,7 @@
           <w:p>
             <w:pPr>
               <w:rPr>
-                <w:rFonts w:ascii="Futura Medium" w:hAnsi="Futura Medium" w:cs="Futura Medium" w:hint="cs"/>
+                <w:rFonts w:ascii="Futura Medium" w:hAnsi="Futura Medium" w:cs="Futura Medium"/>
                 <w:sz w:val="20"/>
                 <w:szCs w:val="20"/>
                 <w:lang w:val="en-US"/>
@@ -4649,7 +4620,7 @@
           <w:p>
             <w:pPr>
               <w:rPr>
-                <w:rFonts w:ascii="Futura Medium" w:hAnsi="Futura Medium" w:cs="Futura Medium" w:hint="cs"/>
+                <w:rFonts w:ascii="Futura Medium" w:hAnsi="Futura Medium" w:cs="Futura Medium"/>
                 <w:sz w:val="20"/>
                 <w:szCs w:val="20"/>
                 <w:lang w:val="en-US"/>
@@ -4681,7 +4652,7 @@
           <w:p>
             <w:pPr>
               <w:rPr>
-                <w:rFonts w:ascii="Futura Medium" w:hAnsi="Futura Medium" w:cs="Futura Medium" w:hint="cs"/>
+                <w:rFonts w:ascii="Futura Medium" w:hAnsi="Futura Medium" w:cs="Futura Medium"/>
                 <w:sz w:val="20"/>
                 <w:szCs w:val="20"/>
                 <w:lang w:val="en-US"/>
@@ -4713,7 +4684,7 @@
           <w:p>
             <w:pPr>
               <w:rPr>
-                <w:rFonts w:ascii="Futura Medium" w:hAnsi="Futura Medium" w:cs="Futura Medium" w:hint="cs"/>
+                <w:rFonts w:ascii="Futura Medium" w:hAnsi="Futura Medium" w:cs="Futura Medium"/>
                 <w:sz w:val="20"/>
                 <w:szCs w:val="20"/>
                 <w:lang w:val="en-US"/>
@@ -4777,7 +4748,7 @@
           <w:p>
             <w:pPr>
               <w:rPr>
-                <w:rFonts w:ascii="Futura Medium" w:hAnsi="Futura Medium" w:cs="Futura Medium" w:hint="cs"/>
+                <w:rFonts w:ascii="Futura Medium" w:hAnsi="Futura Medium" w:cs="Futura Medium"/>
                 <w:sz w:val="20"/>
                 <w:szCs w:val="20"/>
               </w:rPr>
@@ -4791,7 +4762,7 @@
           <w:p>
             <w:pPr>
               <w:rPr>
-                <w:rFonts w:ascii="Futura Medium" w:hAnsi="Futura Medium" w:cs="Futura Medium" w:hint="cs"/>
+                <w:rFonts w:ascii="Futura Medium" w:hAnsi="Futura Medium" w:cs="Futura Medium"/>
                 <w:sz w:val="20"/>
                 <w:szCs w:val="20"/>
               </w:rPr>
@@ -4805,7 +4776,7 @@
           <w:p>
             <w:pPr>
               <w:rPr>
-                <w:rFonts w:ascii="Futura Medium" w:hAnsi="Futura Medium" w:cs="Futura Medium" w:hint="cs"/>
+                <w:rFonts w:ascii="Futura Medium" w:hAnsi="Futura Medium" w:cs="Futura Medium"/>
                 <w:sz w:val="20"/>
                 <w:szCs w:val="20"/>
               </w:rPr>
@@ -4819,7 +4790,7 @@
           <w:p>
             <w:pPr>
               <w:rPr>
-                <w:rFonts w:ascii="Futura Medium" w:hAnsi="Futura Medium" w:cs="Futura Medium" w:hint="cs"/>
+                <w:rFonts w:ascii="Futura Medium" w:hAnsi="Futura Medium" w:cs="Futura Medium"/>
                 <w:sz w:val="20"/>
                 <w:szCs w:val="20"/>
               </w:rPr>
@@ -4833,7 +4804,7 @@
           <w:p>
             <w:pPr>
               <w:rPr>
-                <w:rFonts w:ascii="Futura Medium" w:hAnsi="Futura Medium" w:cs="Futura Medium" w:hint="cs"/>
+                <w:rFonts w:ascii="Futura Medium" w:hAnsi="Futura Medium" w:cs="Futura Medium"/>
                 <w:sz w:val="20"/>
                 <w:szCs w:val="20"/>
               </w:rPr>
@@ -4872,7 +4843,7 @@
           <w:p>
             <w:pPr>
               <w:rPr>
-                <w:rFonts w:ascii="Futura Medium" w:hAnsi="Futura Medium" w:cs="Futura Medium" w:hint="cs"/>
+                <w:rFonts w:ascii="Futura Medium" w:hAnsi="Futura Medium" w:cs="Futura Medium"/>
                 <w:sz w:val="20"/>
                 <w:szCs w:val="20"/>
                 <w:lang w:val="en-US"/>
@@ -4895,7 +4866,7 @@
           <w:p>
             <w:pPr>
               <w:rPr>
-                <w:rFonts w:ascii="Futura Medium" w:hAnsi="Futura Medium" w:cs="Futura Medium" w:hint="cs"/>
+                <w:rFonts w:ascii="Futura Medium" w:hAnsi="Futura Medium" w:cs="Futura Medium"/>
                 <w:sz w:val="20"/>
                 <w:szCs w:val="20"/>
                 <w:lang w:val="en-US"/>
@@ -4918,7 +4889,7 @@
           <w:p>
             <w:pPr>
               <w:rPr>
-                <w:rFonts w:ascii="Futura Medium" w:hAnsi="Futura Medium" w:cs="Futura Medium" w:hint="cs"/>
+                <w:rFonts w:ascii="Futura Medium" w:hAnsi="Futura Medium" w:cs="Futura Medium"/>
                 <w:sz w:val="20"/>
                 <w:szCs w:val="20"/>
                 <w:lang w:val="en-US"/>
@@ -4941,7 +4912,7 @@
           <w:p>
             <w:pPr>
               <w:rPr>
-                <w:rFonts w:ascii="Futura Medium" w:hAnsi="Futura Medium" w:cs="Futura Medium" w:hint="cs"/>
+                <w:rFonts w:ascii="Futura Medium" w:hAnsi="Futura Medium" w:cs="Futura Medium"/>
                 <w:sz w:val="20"/>
                 <w:szCs w:val="20"/>
                 <w:lang w:val="en-US"/>
@@ -4964,7 +4935,7 @@
           <w:p>
             <w:pPr>
               <w:rPr>
-                <w:rFonts w:ascii="Futura Medium" w:hAnsi="Futura Medium" w:cs="Futura Medium" w:hint="cs"/>
+                <w:rFonts w:ascii="Futura Medium" w:hAnsi="Futura Medium" w:cs="Futura Medium"/>
                 <w:sz w:val="20"/>
                 <w:szCs w:val="20"/>
                 <w:lang w:val="en-US"/>
@@ -5020,7 +4991,7 @@
           <w:p>
             <w:pPr>
               <w:rPr>
-                <w:rFonts w:ascii="Futura Medium" w:hAnsi="Futura Medium" w:cs="Futura Medium" w:hint="cs"/>
+                <w:rFonts w:ascii="Futura Medium" w:hAnsi="Futura Medium" w:cs="Futura Medium"/>
                 <w:sz w:val="20"/>
                 <w:szCs w:val="20"/>
               </w:rPr>
@@ -5045,7 +5016,7 @@
           <w:p>
             <w:pPr>
               <w:rPr>
-                <w:rFonts w:ascii="Futura Medium" w:hAnsi="Futura Medium" w:cs="Futura Medium" w:hint="cs"/>
+                <w:rFonts w:ascii="Futura Medium" w:hAnsi="Futura Medium" w:cs="Futura Medium"/>
                 <w:sz w:val="20"/>
                 <w:szCs w:val="20"/>
               </w:rPr>
@@ -5070,7 +5041,7 @@
           <w:p>
             <w:pPr>
               <w:rPr>
-                <w:rFonts w:ascii="Futura Medium" w:hAnsi="Futura Medium" w:cs="Futura Medium" w:hint="cs"/>
+                <w:rFonts w:ascii="Futura Medium" w:hAnsi="Futura Medium" w:cs="Futura Medium"/>
                 <w:sz w:val="20"/>
                 <w:szCs w:val="20"/>
               </w:rPr>
@@ -5104,7 +5075,7 @@
           <w:p>
             <w:pPr>
               <w:rPr>
-                <w:rFonts w:ascii="Futura Medium" w:hAnsi="Futura Medium" w:cs="Futura Medium" w:hint="cs"/>
+                <w:rFonts w:ascii="Futura Medium" w:hAnsi="Futura Medium" w:cs="Futura Medium"/>
                 <w:sz w:val="20"/>
                 <w:szCs w:val="20"/>
                 <w:lang w:val="en-US"/>
@@ -5139,7 +5110,7 @@
           <w:p>
             <w:pPr>
               <w:rPr>
-                <w:rFonts w:ascii="Futura Medium" w:hAnsi="Futura Medium" w:cs="Futura Medium" w:hint="cs"/>
+                <w:rFonts w:ascii="Futura Medium" w:hAnsi="Futura Medium" w:cs="Futura Medium"/>
                 <w:sz w:val="20"/>
                 <w:szCs w:val="20"/>
               </w:rPr>
@@ -5167,7 +5138,7 @@
           <w:p>
             <w:pPr>
               <w:rPr>
-                <w:rFonts w:ascii="Futura Medium" w:hAnsi="Futura Medium" w:cs="Futura Medium" w:hint="cs"/>
+                <w:rFonts w:ascii="Futura Medium" w:hAnsi="Futura Medium" w:cs="Futura Medium"/>
                 <w:sz w:val="20"/>
                 <w:szCs w:val="20"/>
               </w:rPr>
@@ -5251,7 +5222,7 @@
           <w:p>
             <w:pPr>
               <w:rPr>
-                <w:rFonts w:ascii="Futura Medium" w:hAnsi="Futura Medium" w:cs="Futura Medium" w:hint="cs"/>
+                <w:rFonts w:ascii="Futura Medium" w:hAnsi="Futura Medium" w:cs="Futura Medium"/>
                 <w:sz w:val="20"/>
                 <w:szCs w:val="20"/>
               </w:rPr>
@@ -5265,7 +5236,7 @@
           <w:p>
             <w:pPr>
               <w:rPr>
-                <w:rFonts w:ascii="Futura Medium" w:hAnsi="Futura Medium" w:cs="Futura Medium" w:hint="cs"/>
+                <w:rFonts w:ascii="Futura Medium" w:hAnsi="Futura Medium" w:cs="Futura Medium"/>
                 <w:sz w:val="20"/>
                 <w:szCs w:val="20"/>
               </w:rPr>
@@ -5279,7 +5250,7 @@
           <w:p>
             <w:pPr>
               <w:rPr>
-                <w:rFonts w:ascii="Futura Medium" w:hAnsi="Futura Medium" w:cs="Futura Medium" w:hint="cs"/>
+                <w:rFonts w:ascii="Futura Medium" w:hAnsi="Futura Medium" w:cs="Futura Medium"/>
                 <w:sz w:val="20"/>
                 <w:szCs w:val="20"/>
               </w:rPr>
@@ -5308,7 +5279,7 @@
           <w:p>
             <w:pPr>
               <w:rPr>
-                <w:rFonts w:ascii="Futura Medium" w:hAnsi="Futura Medium" w:cs="Futura Medium" w:hint="cs"/>
+                <w:rFonts w:ascii="Futura Medium" w:hAnsi="Futura Medium" w:cs="Futura Medium"/>
                 <w:sz w:val="20"/>
                 <w:szCs w:val="20"/>
               </w:rPr>
@@ -5347,7 +5318,7 @@
           <w:p>
             <w:pPr>
               <w:rPr>
-                <w:rFonts w:ascii="Futura Medium" w:hAnsi="Futura Medium" w:cs="Futura Medium" w:hint="cs"/>
+                <w:rFonts w:ascii="Futura Medium" w:hAnsi="Futura Medium" w:cs="Futura Medium"/>
                 <w:sz w:val="20"/>
                 <w:szCs w:val="20"/>
                 <w:lang w:val="en-US"/>
@@ -5370,7 +5341,7 @@
           <w:p>
             <w:pPr>
               <w:rPr>
-                <w:rFonts w:ascii="Futura Medium" w:hAnsi="Futura Medium" w:cs="Futura Medium" w:hint="cs"/>
+                <w:rFonts w:ascii="Futura Medium" w:hAnsi="Futura Medium" w:cs="Futura Medium"/>
                 <w:sz w:val="20"/>
                 <w:szCs w:val="20"/>
                 <w:lang w:val="en-US"/>
@@ -5393,7 +5364,7 @@
           <w:p>
             <w:pPr>
               <w:rPr>
-                <w:rFonts w:ascii="Futura Medium" w:hAnsi="Futura Medium" w:cs="Futura Medium" w:hint="cs"/>
+                <w:rFonts w:ascii="Futura Medium" w:hAnsi="Futura Medium" w:cs="Futura Medium"/>
                 <w:sz w:val="20"/>
                 <w:szCs w:val="20"/>
                 <w:lang w:val="en-US"/>
@@ -5416,7 +5387,7 @@
           <w:p>
             <w:pPr>
               <w:rPr>
-                <w:rFonts w:ascii="Futura Medium" w:hAnsi="Futura Medium" w:cs="Futura Medium" w:hint="cs"/>
+                <w:rFonts w:ascii="Futura Medium" w:hAnsi="Futura Medium" w:cs="Futura Medium"/>
                 <w:sz w:val="20"/>
                 <w:szCs w:val="20"/>
                 <w:lang w:val="en-US"/>
@@ -5448,7 +5419,7 @@
           <w:p>
             <w:pPr>
               <w:rPr>
-                <w:rFonts w:ascii="Futura Medium" w:hAnsi="Futura Medium" w:cs="Futura Medium" w:hint="cs"/>
+                <w:rFonts w:ascii="Futura Medium" w:hAnsi="Futura Medium" w:cs="Futura Medium"/>
                 <w:sz w:val="20"/>
                 <w:szCs w:val="20"/>
                 <w:lang w:val="en-US"/>
@@ -5498,7 +5469,7 @@
           <w:p>
             <w:pPr>
               <w:rPr>
-                <w:rFonts w:ascii="Futura Medium" w:hAnsi="Futura Medium" w:cs="Futura Medium" w:hint="cs"/>
+                <w:rFonts w:ascii="Futura Medium" w:hAnsi="Futura Medium" w:cs="Futura Medium"/>
                 <w:sz w:val="20"/>
                 <w:szCs w:val="20"/>
                 <w:lang w:val="en-US"/>
@@ -5521,7 +5492,7 @@
           <w:p>
             <w:pPr>
               <w:rPr>
-                <w:rFonts w:ascii="Futura Medium" w:hAnsi="Futura Medium" w:cs="Futura Medium" w:hint="cs"/>
+                <w:rFonts w:ascii="Futura Medium" w:hAnsi="Futura Medium" w:cs="Futura Medium"/>
                 <w:sz w:val="20"/>
                 <w:szCs w:val="20"/>
                 <w:lang w:val="en-US"/>
@@ -5544,7 +5515,7 @@
           <w:p>
             <w:pPr>
               <w:rPr>
-                <w:rFonts w:ascii="Futura Medium" w:hAnsi="Futura Medium" w:cs="Futura Medium" w:hint="cs"/>
+                <w:rFonts w:ascii="Futura Medium" w:hAnsi="Futura Medium" w:cs="Futura Medium"/>
                 <w:sz w:val="20"/>
                 <w:szCs w:val="20"/>
                 <w:lang w:val="en-US"/>
@@ -5567,7 +5538,7 @@
           <w:p>
             <w:pPr>
               <w:rPr>
-                <w:rFonts w:ascii="Futura Medium" w:hAnsi="Futura Medium" w:cs="Futura Medium" w:hint="cs"/>
+                <w:rFonts w:ascii="Futura Medium" w:hAnsi="Futura Medium" w:cs="Futura Medium"/>
                 <w:sz w:val="20"/>
                 <w:szCs w:val="20"/>
                 <w:lang w:val="en-US"/>
@@ -5599,7 +5570,7 @@
           <w:p>
             <w:pPr>
               <w:rPr>
-                <w:rFonts w:ascii="Futura Medium" w:hAnsi="Futura Medium" w:cs="Futura Medium" w:hint="cs"/>
+                <w:rFonts w:ascii="Futura Medium" w:hAnsi="Futura Medium" w:cs="Futura Medium"/>
                 <w:sz w:val="20"/>
                 <w:szCs w:val="20"/>
                 <w:lang w:val="en-US"/>
@@ -5663,7 +5634,7 @@
           <w:p>
             <w:pPr>
               <w:rPr>
-                <w:rFonts w:ascii="Futura Medium" w:hAnsi="Futura Medium" w:cs="Futura Medium" w:hint="cs"/>
+                <w:rFonts w:ascii="Futura Medium" w:hAnsi="Futura Medium" w:cs="Futura Medium"/>
                 <w:sz w:val="20"/>
                 <w:szCs w:val="20"/>
               </w:rPr>
@@ -5677,7 +5648,7 @@
           <w:p>
             <w:pPr>
               <w:rPr>
-                <w:rFonts w:ascii="Futura Medium" w:hAnsi="Futura Medium" w:cs="Futura Medium" w:hint="cs"/>
+                <w:rFonts w:ascii="Futura Medium" w:hAnsi="Futura Medium" w:cs="Futura Medium"/>
                 <w:sz w:val="20"/>
                 <w:szCs w:val="20"/>
               </w:rPr>
@@ -5691,7 +5662,7 @@
           <w:p>
             <w:pPr>
               <w:rPr>
-                <w:rFonts w:ascii="Futura Medium" w:hAnsi="Futura Medium" w:cs="Futura Medium" w:hint="cs"/>
+                <w:rFonts w:ascii="Futura Medium" w:hAnsi="Futura Medium" w:cs="Futura Medium"/>
                 <w:sz w:val="20"/>
                 <w:szCs w:val="20"/>
               </w:rPr>
@@ -5705,7 +5676,7 @@
           <w:p>
             <w:pPr>
               <w:rPr>
-                <w:rFonts w:ascii="Futura Medium" w:hAnsi="Futura Medium" w:cs="Futura Medium" w:hint="cs"/>
+                <w:rFonts w:ascii="Futura Medium" w:hAnsi="Futura Medium" w:cs="Futura Medium"/>
                 <w:sz w:val="20"/>
                 <w:szCs w:val="20"/>
               </w:rPr>
@@ -5719,7 +5690,7 @@
           <w:p>
             <w:pPr>
               <w:rPr>
-                <w:rFonts w:ascii="Futura Medium" w:hAnsi="Futura Medium" w:cs="Futura Medium" w:hint="cs"/>
+                <w:rFonts w:ascii="Futura Medium" w:hAnsi="Futura Medium" w:cs="Futura Medium"/>
                 <w:sz w:val="20"/>
                 <w:szCs w:val="20"/>
               </w:rPr>
@@ -5758,7 +5729,7 @@
           <w:p>
             <w:pPr>
               <w:rPr>
-                <w:rFonts w:ascii="Futura Medium" w:hAnsi="Futura Medium" w:cs="Futura Medium" w:hint="cs"/>
+                <w:rFonts w:ascii="Futura Medium" w:hAnsi="Futura Medium" w:cs="Futura Medium"/>
                 <w:sz w:val="20"/>
                 <w:szCs w:val="20"/>
                 <w:lang w:val="en-US"/>
@@ -5781,7 +5752,7 @@
           <w:p>
             <w:pPr>
               <w:rPr>
-                <w:rFonts w:ascii="Futura Medium" w:hAnsi="Futura Medium" w:cs="Futura Medium" w:hint="cs"/>
+                <w:rFonts w:ascii="Futura Medium" w:hAnsi="Futura Medium" w:cs="Futura Medium"/>
                 <w:sz w:val="20"/>
                 <w:szCs w:val="20"/>
                 <w:lang w:val="en-US"/>
@@ -5804,7 +5775,7 @@
           <w:p>
             <w:pPr>
               <w:rPr>
-                <w:rFonts w:ascii="Futura Medium" w:hAnsi="Futura Medium" w:cs="Futura Medium" w:hint="cs"/>
+                <w:rFonts w:ascii="Futura Medium" w:hAnsi="Futura Medium" w:cs="Futura Medium"/>
                 <w:sz w:val="20"/>
                 <w:szCs w:val="20"/>
                 <w:lang w:val="en-US"/>
@@ -5827,7 +5798,7 @@
           <w:p>
             <w:pPr>
               <w:rPr>
-                <w:rFonts w:ascii="Futura Medium" w:hAnsi="Futura Medium" w:cs="Futura Medium" w:hint="cs"/>
+                <w:rFonts w:ascii="Futura Medium" w:hAnsi="Futura Medium" w:cs="Futura Medium"/>
                 <w:sz w:val="20"/>
                 <w:szCs w:val="20"/>
                 <w:lang w:val="en-US"/>
@@ -5850,7 +5821,7 @@
           <w:p>
             <w:pPr>
               <w:rPr>
-                <w:rFonts w:ascii="Futura Medium" w:hAnsi="Futura Medium" w:cs="Futura Medium" w:hint="cs"/>
+                <w:rFonts w:ascii="Futura Medium" w:hAnsi="Futura Medium" w:cs="Futura Medium"/>
                 <w:sz w:val="20"/>
                 <w:szCs w:val="20"/>
                 <w:lang w:val="en-US"/>
@@ -5906,7 +5877,7 @@
           <w:p>
             <w:pPr>
               <w:rPr>
-                <w:rFonts w:ascii="Futura Medium" w:hAnsi="Futura Medium" w:cs="Futura Medium" w:hint="cs"/>
+                <w:rFonts w:ascii="Futura Medium" w:hAnsi="Futura Medium" w:cs="Futura Medium"/>
                 <w:sz w:val="20"/>
                 <w:szCs w:val="20"/>
               </w:rPr>
@@ -5931,7 +5902,7 @@
           <w:p>
             <w:pPr>
               <w:rPr>
-                <w:rFonts w:ascii="Futura Medium" w:hAnsi="Futura Medium" w:cs="Futura Medium" w:hint="cs"/>
+                <w:rFonts w:ascii="Futura Medium" w:hAnsi="Futura Medium" w:cs="Futura Medium"/>
                 <w:sz w:val="20"/>
                 <w:szCs w:val="20"/>
               </w:rPr>
@@ -5956,7 +5927,7 @@
           <w:p>
             <w:pPr>
               <w:rPr>
-                <w:rFonts w:ascii="Futura Medium" w:hAnsi="Futura Medium" w:cs="Futura Medium" w:hint="cs"/>
+                <w:rFonts w:ascii="Futura Medium" w:hAnsi="Futura Medium" w:cs="Futura Medium"/>
                 <w:sz w:val="20"/>
                 <w:szCs w:val="20"/>
               </w:rPr>
@@ -5981,7 +5952,7 @@
           <w:p>
             <w:pPr>
               <w:rPr>
-                <w:rFonts w:ascii="Futura Medium" w:hAnsi="Futura Medium" w:cs="Futura Medium" w:hint="cs"/>
+                <w:rFonts w:ascii="Futura Medium" w:hAnsi="Futura Medium" w:cs="Futura Medium"/>
                 <w:sz w:val="20"/>
                 <w:szCs w:val="20"/>
               </w:rPr>
@@ -6015,7 +5986,7 @@
           <w:p>
             <w:pPr>
               <w:rPr>
-                <w:rFonts w:ascii="Futura Medium" w:hAnsi="Futura Medium" w:cs="Futura Medium" w:hint="cs"/>
+                <w:rFonts w:ascii="Futura Medium" w:hAnsi="Futura Medium" w:cs="Futura Medium"/>
                 <w:sz w:val="20"/>
                 <w:szCs w:val="20"/>
               </w:rPr>
@@ -6501,7 +6472,7 @@
           <w:p>
             <w:pPr>
               <w:rPr>
-                <w:rFonts w:ascii="Futura Medium" w:hAnsi="Futura Medium" w:cs="Futura Medium" w:hint="cs"/>
+                <w:rFonts w:ascii="Futura Medium" w:hAnsi="Futura Medium" w:cs="Futura Medium"/>
                 <w:sz w:val="20"/>
                 <w:szCs w:val="20"/>
                 <w:lang w:val="en-US"/>
@@ -6524,7 +6495,7 @@
           <w:p>
             <w:pPr>
               <w:rPr>
-                <w:rFonts w:ascii="Futura Medium" w:hAnsi="Futura Medium" w:cs="Futura Medium" w:hint="cs"/>
+                <w:rFonts w:ascii="Futura Medium" w:hAnsi="Futura Medium" w:cs="Futura Medium"/>
                 <w:sz w:val="20"/>
                 <w:szCs w:val="20"/>
                 <w:lang w:val="en-US"/>
@@ -6547,7 +6518,7 @@
           <w:p>
             <w:pPr>
               <w:rPr>
-                <w:rFonts w:ascii="Futura Medium" w:hAnsi="Futura Medium" w:cs="Futura Medium" w:hint="cs"/>
+                <w:rFonts w:ascii="Futura Medium" w:hAnsi="Futura Medium" w:cs="Futura Medium"/>
                 <w:sz w:val="20"/>
                 <w:szCs w:val="20"/>
                 <w:lang w:val="en-US"/>
@@ -6570,7 +6541,7 @@
           <w:p>
             <w:pPr>
               <w:rPr>
-                <w:rFonts w:ascii="Futura Medium" w:hAnsi="Futura Medium" w:cs="Futura Medium" w:hint="cs"/>
+                <w:rFonts w:ascii="Futura Medium" w:hAnsi="Futura Medium" w:cs="Futura Medium"/>
                 <w:sz w:val="20"/>
                 <w:szCs w:val="20"/>
                 <w:lang w:val="en-US"/>
@@ -6602,7 +6573,7 @@
           <w:p>
             <w:pPr>
               <w:rPr>
-                <w:rFonts w:ascii="Futura Medium" w:hAnsi="Futura Medium" w:cs="Futura Medium" w:hint="cs"/>
+                <w:rFonts w:ascii="Futura Medium" w:hAnsi="Futura Medium" w:cs="Futura Medium"/>
                 <w:sz w:val="20"/>
                 <w:szCs w:val="20"/>
                 <w:lang w:val="en-US"/>
@@ -6657,7 +6628,7 @@
           <w:p>
             <w:pPr>
               <w:rPr>
-                <w:rFonts w:ascii="Futura Medium" w:hAnsi="Futura Medium" w:cs="Futura Medium" w:hint="cs"/>
+                <w:rFonts w:ascii="Futura Medium" w:hAnsi="Futura Medium" w:cs="Futura Medium"/>
                 <w:sz w:val="20"/>
                 <w:szCs w:val="20"/>
                 <w:lang w:val="en-US"/>
@@ -6683,7 +6654,7 @@
           <w:p>
             <w:pPr>
               <w:rPr>
-                <w:rFonts w:ascii="Futura Medium" w:hAnsi="Futura Medium" w:cs="Futura Medium" w:hint="cs"/>
+                <w:rFonts w:ascii="Futura Medium" w:hAnsi="Futura Medium" w:cs="Futura Medium"/>
                 <w:sz w:val="20"/>
                 <w:szCs w:val="20"/>
                 <w:lang w:val="en-US"/>
@@ -6709,7 +6680,7 @@
           <w:p>
             <w:pPr>
               <w:rPr>
-                <w:rFonts w:ascii="Futura Medium" w:hAnsi="Futura Medium" w:cs="Futura Medium" w:hint="cs"/>
+                <w:rFonts w:ascii="Futura Medium" w:hAnsi="Futura Medium" w:cs="Futura Medium"/>
                 <w:sz w:val="20"/>
                 <w:szCs w:val="20"/>
                 <w:lang w:val="en-US"/>
@@ -6735,7 +6706,7 @@
           <w:p>
             <w:pPr>
               <w:rPr>
-                <w:rFonts w:ascii="Futura Medium" w:hAnsi="Futura Medium" w:cs="Futura Medium" w:hint="cs"/>
+                <w:rFonts w:ascii="Futura Medium" w:hAnsi="Futura Medium" w:cs="Futura Medium"/>
                 <w:sz w:val="20"/>
                 <w:szCs w:val="20"/>
                 <w:lang w:val="en-US"/>
@@ -6761,7 +6732,7 @@
           <w:p>
             <w:pPr>
               <w:rPr>
-                <w:rFonts w:ascii="Futura Medium" w:hAnsi="Futura Medium" w:cs="Futura Medium" w:hint="cs"/>
+                <w:rFonts w:ascii="Futura Medium" w:hAnsi="Futura Medium" w:cs="Futura Medium"/>
                 <w:sz w:val="20"/>
                 <w:szCs w:val="20"/>
                 <w:lang w:val="en-US"/>
@@ -6790,7 +6761,7 @@
           <w:p>
             <w:pPr>
               <w:rPr>
-                <w:rFonts w:ascii="Futura Medium" w:hAnsi="Futura Medium" w:cs="Futura Medium" w:hint="cs"/>
+                <w:rFonts w:ascii="Futura Medium" w:hAnsi="Futura Medium" w:cs="Futura Medium"/>
                 <w:sz w:val="20"/>
                 <w:szCs w:val="20"/>
                 <w:lang w:val="en-US"/>
@@ -6860,7 +6831,7 @@
           <w:p>
             <w:pPr>
               <w:rPr>
-                <w:rFonts w:ascii="Futura Medium" w:hAnsi="Futura Medium" w:cs="Futura Medium" w:hint="cs"/>
+                <w:rFonts w:ascii="Futura Medium" w:hAnsi="Futura Medium" w:cs="Futura Medium"/>
                 <w:sz w:val="20"/>
                 <w:szCs w:val="20"/>
                 <w:lang w:val="en-US"/>
@@ -6883,7 +6854,7 @@
           <w:p>
             <w:pPr>
               <w:rPr>
-                <w:rFonts w:ascii="Futura Medium" w:hAnsi="Futura Medium" w:cs="Futura Medium" w:hint="cs"/>
+                <w:rFonts w:ascii="Futura Medium" w:hAnsi="Futura Medium" w:cs="Futura Medium"/>
                 <w:sz w:val="20"/>
                 <w:szCs w:val="20"/>
                 <w:lang w:val="en-US"/>
@@ -6906,7 +6877,7 @@
           <w:p>
             <w:pPr>
               <w:rPr>
-                <w:rFonts w:ascii="Futura Medium" w:hAnsi="Futura Medium" w:cs="Futura Medium" w:hint="cs"/>
+                <w:rFonts w:ascii="Futura Medium" w:hAnsi="Futura Medium" w:cs="Futura Medium"/>
                 <w:sz w:val="20"/>
                 <w:szCs w:val="20"/>
                 <w:lang w:val="en-US"/>
@@ -6929,7 +6900,7 @@
           <w:p>
             <w:pPr>
               <w:rPr>
-                <w:rFonts w:ascii="Futura Medium" w:hAnsi="Futura Medium" w:cs="Futura Medium" w:hint="cs"/>
+                <w:rFonts w:ascii="Futura Medium" w:hAnsi="Futura Medium" w:cs="Futura Medium"/>
                 <w:sz w:val="20"/>
                 <w:szCs w:val="20"/>
                 <w:lang w:val="en-US"/>
@@ -6952,7 +6923,7 @@
           <w:p>
             <w:pPr>
               <w:rPr>
-                <w:rFonts w:ascii="Futura Medium" w:hAnsi="Futura Medium" w:cs="Futura Medium" w:hint="cs"/>
+                <w:rFonts w:ascii="Futura Medium" w:hAnsi="Futura Medium" w:cs="Futura Medium"/>
                 <w:sz w:val="20"/>
                 <w:szCs w:val="20"/>
                 <w:lang w:val="en-US"/>
@@ -7007,7 +6978,7 @@
           <w:p>
             <w:pPr>
               <w:rPr>
-                <w:rFonts w:ascii="Futura Medium" w:hAnsi="Futura Medium" w:cs="Futura Medium" w:hint="cs"/>
+                <w:rFonts w:ascii="Futura Medium" w:hAnsi="Futura Medium" w:cs="Futura Medium"/>
                 <w:sz w:val="20"/>
                 <w:szCs w:val="20"/>
                 <w:lang w:val="en-US"/>
@@ -7033,7 +7004,7 @@
           <w:p>
             <w:pPr>
               <w:rPr>
-                <w:rFonts w:ascii="Futura Medium" w:hAnsi="Futura Medium" w:cs="Futura Medium" w:hint="cs"/>
+                <w:rFonts w:ascii="Futura Medium" w:hAnsi="Futura Medium" w:cs="Futura Medium"/>
                 <w:sz w:val="20"/>
                 <w:szCs w:val="20"/>
                 <w:lang w:val="en-US"/>
@@ -7059,7 +7030,7 @@
           <w:p>
             <w:pPr>
               <w:rPr>
-                <w:rFonts w:ascii="Futura Medium" w:hAnsi="Futura Medium" w:cs="Futura Medium" w:hint="cs"/>
+                <w:rFonts w:ascii="Futura Medium" w:hAnsi="Futura Medium" w:cs="Futura Medium"/>
                 <w:sz w:val="20"/>
                 <w:szCs w:val="20"/>
                 <w:lang w:val="en-US"/>
@@ -7094,7 +7065,7 @@
           <w:p>
             <w:pPr>
               <w:rPr>
-                <w:rFonts w:ascii="Futura Medium" w:hAnsi="Futura Medium" w:cs="Futura Medium" w:hint="cs"/>
+                <w:rFonts w:ascii="Futura Medium" w:hAnsi="Futura Medium" w:cs="Futura Medium"/>
                 <w:sz w:val="20"/>
                 <w:szCs w:val="20"/>
                 <w:lang w:val="en-US"/>
@@ -7129,7 +7100,7 @@
           <w:p>
             <w:pPr>
               <w:rPr>
-                <w:rFonts w:ascii="Futura Medium" w:hAnsi="Futura Medium" w:cs="Futura Medium" w:hint="cs"/>
+                <w:rFonts w:ascii="Futura Medium" w:hAnsi="Futura Medium" w:cs="Futura Medium"/>
                 <w:sz w:val="20"/>
                 <w:szCs w:val="20"/>
                 <w:lang w:val="en-US"/>
@@ -7160,6 +7131,16 @@
     <w:p>
       <w:pPr>
         <w:rPr>
+          <w:rFonts w:ascii="Futura Medium" w:hAnsi="Futura Medium" w:cs="Futura Medium"/>
+          <w:sz w:val="20"/>
+          <w:szCs w:val="20"/>
+          <w:lang w:val="en-US"/>
+        </w:rPr>
+      </w:pPr>
+    </w:p>
+    <w:p>
+      <w:pPr>
+        <w:rPr>
           <w:rFonts w:ascii="Futura" w:hAnsi="Futura" w:cs="Futura Medium"/>
           <w:b/>
           <w:bCs/>
@@ -7180,8 +7161,8 @@
       <w:pPr>
         <w:rPr>
           <w:rFonts w:ascii="Futura" w:hAnsi="Futura" w:cs="Futura Medium"/>
-          <w:b/>
-          <w:bCs/>
+          <w:sz w:val="20"/>
+          <w:szCs w:val="20"/>
           <w:lang w:val="en-US"/>
         </w:rPr>
       </w:pPr>
@@ -7200,7 +7181,7 @@
           <w:lang w:val="en-US"/>
         </w:rPr>
         <w:drawing>
-          <wp:inline distT="0" distB="0" distL="0" distR="0" wp14:anchorId="50A33CE3" wp14:editId="476EE6B2">
+          <wp:inline distT="0" distB="0" distL="0" distR="0" wp14:anchorId="50A33CE3" wp14:editId="2BA5C50D">
             <wp:extent cx="5760000" cy="2880000"/>
             <wp:effectExtent l="0" t="0" r="6350" b="3175"/>
             <wp:docPr id="290721486" name="Picture 1"/>
@@ -7211,7 +7192,7 @@
               <a:graphicData uri="http://schemas.openxmlformats.org/drawingml/2006/picture">
                 <pic:pic xmlns:pic="http://schemas.openxmlformats.org/drawingml/2006/picture">
                   <pic:nvPicPr>
-                    <pic:cNvPr id="290721486" name="Picture 290721486"/>
+                    <pic:cNvPr id="290721486" name="Picture 1"/>
                     <pic:cNvPicPr/>
                   </pic:nvPicPr>
                   <pic:blipFill>
@@ -7452,6 +7433,50 @@
           <w:szCs w:val="20"/>
         </w:rPr>
       </w:pPr>
+      <w:r>
+        <w:rPr>
+          <w:rFonts w:ascii="Futura Medium" w:hAnsi="Futura Medium" w:cs="Futura Medium"/>
+          <w:noProof/>
+          <w:sz w:val="20"/>
+          <w:szCs w:val="20"/>
+        </w:rPr>
+        <w:lastRenderedPageBreak/>
+        <w:drawing>
+          <wp:inline distT="0" distB="0" distL="0" distR="0" wp14:anchorId="62180C1F" wp14:editId="2C36EA42">
+            <wp:extent cx="2880000" cy="4325088"/>
+            <wp:effectExtent l="0" t="0" r="3175" b="5715"/>
+            <wp:docPr id="1504372576" name="Picture 1"/>
+            <wp:cNvGraphicFramePr>
+              <a:graphicFrameLocks xmlns:a="http://schemas.openxmlformats.org/drawingml/2006/main" noChangeAspect="1"/>
+            </wp:cNvGraphicFramePr>
+            <a:graphic xmlns:a="http://schemas.openxmlformats.org/drawingml/2006/main">
+              <a:graphicData uri="http://schemas.openxmlformats.org/drawingml/2006/picture">
+                <pic:pic xmlns:pic="http://schemas.openxmlformats.org/drawingml/2006/picture">
+                  <pic:nvPicPr>
+                    <pic:cNvPr id="1504372576" name="Picture 1504372576"/>
+                    <pic:cNvPicPr/>
+                  </pic:nvPicPr>
+                  <pic:blipFill>
+                    <a:blip r:embed="rId11"/>
+                    <a:stretch>
+                      <a:fillRect/>
+                    </a:stretch>
+                  </pic:blipFill>
+                  <pic:spPr>
+                    <a:xfrm>
+                      <a:off x="0" y="0"/>
+                      <a:ext cx="2880000" cy="4325088"/>
+                    </a:xfrm>
+                    <a:prstGeom prst="rect">
+                      <a:avLst/>
+                    </a:prstGeom>
+                  </pic:spPr>
+                </pic:pic>
+              </a:graphicData>
+            </a:graphic>
+          </wp:inline>
+        </w:drawing>
+      </w:r>
     </w:p>
     <w:p>
       <w:pPr>
@@ -7467,7 +7492,6 @@
           <w:sz w:val="20"/>
           <w:szCs w:val="20"/>
         </w:rPr>
-        <w:lastRenderedPageBreak/>
         <w:t>Figure S2</w:t>
       </w:r>
       <w:r>
@@ -7692,13 +7716,55 @@
           <w:szCs w:val="20"/>
         </w:rPr>
       </w:pPr>
+      <w:r>
+        <w:rPr>
+          <w:rFonts w:ascii="Futura Medium" w:hAnsi="Futura Medium" w:cs="Futura Medium"/>
+          <w:noProof/>
+          <w:sz w:val="20"/>
+          <w:szCs w:val="20"/>
+        </w:rPr>
+        <w:lastRenderedPageBreak/>
+        <w:drawing>
+          <wp:inline distT="0" distB="0" distL="0" distR="0" wp14:anchorId="7855863A" wp14:editId="7D3991DF">
+            <wp:extent cx="2880000" cy="5760000"/>
+            <wp:effectExtent l="0" t="0" r="3175" b="6350"/>
+            <wp:docPr id="1833747875" name="Picture 2"/>
+            <wp:cNvGraphicFramePr>
+              <a:graphicFrameLocks xmlns:a="http://schemas.openxmlformats.org/drawingml/2006/main" noChangeAspect="1"/>
+            </wp:cNvGraphicFramePr>
+            <a:graphic xmlns:a="http://schemas.openxmlformats.org/drawingml/2006/main">
+              <a:graphicData uri="http://schemas.openxmlformats.org/drawingml/2006/picture">
+                <pic:pic xmlns:pic="http://schemas.openxmlformats.org/drawingml/2006/picture">
+                  <pic:nvPicPr>
+                    <pic:cNvPr id="1833747875" name="Picture 1833747875"/>
+                    <pic:cNvPicPr/>
+                  </pic:nvPicPr>
+                  <pic:blipFill>
+                    <a:blip r:embed="rId12"/>
+                    <a:stretch>
+                      <a:fillRect/>
+                    </a:stretch>
+                  </pic:blipFill>
+                  <pic:spPr>
+                    <a:xfrm>
+                      <a:off x="0" y="0"/>
+                      <a:ext cx="2880000" cy="5760000"/>
+                    </a:xfrm>
+                    <a:prstGeom prst="rect">
+                      <a:avLst/>
+                    </a:prstGeom>
+                  </pic:spPr>
+                </pic:pic>
+              </a:graphicData>
+            </a:graphic>
+          </wp:inline>
+        </w:drawing>
+      </w:r>
     </w:p>
     <w:p>
       <w:pPr>
         <w:rPr>
-          <w:rFonts w:ascii="Futura Medium" w:hAnsi="Futura Medium" w:cs="Futura Medium"/>
-          <w:sz w:val="20"/>
-          <w:szCs w:val="20"/>
+          <w:rFonts w:ascii="Times New Roman" w:hAnsi="Times New Roman" w:cs="Times New Roman"/>
         </w:rPr>
       </w:pPr>
       <w:r>
@@ -7713,11 +7779,362 @@
       </w:r>
       <w:r>
         <w:rPr>
-          <w:rFonts w:ascii="Futura Medium" w:hAnsi="Futura Medium" w:cs="Futura Medium"/>
+          <w:rFonts w:ascii="Futura Medium" w:hAnsi="Futura Medium" w:cs="Futura Medium" w:hint="cs"/>
           <w:sz w:val="20"/>
           <w:szCs w:val="20"/>
         </w:rPr>
         <w:t>.</w:t>
+      </w:r>
+      <w:r>
+        <w:rPr>
+          <w:rFonts w:ascii="Futura Medium" w:hAnsi="Futura Medium" w:cs="Futura Medium" w:hint="cs"/>
+          <w:sz w:val="20"/>
+          <w:szCs w:val="20"/>
+        </w:rPr>
+        <w:t xml:space="preserve"> </w:t>
+      </w:r>
+      <w:r>
+        <w:rPr>
+          <w:rFonts w:ascii="Futura Medium" w:eastAsiaTheme="minorEastAsia" w:hAnsi="Futura Medium" w:cs="Futura Medium" w:hint="cs"/>
+          <w:sz w:val="20"/>
+          <w:szCs w:val="20"/>
+        </w:rPr>
+        <w:t xml:space="preserve">Example 2: the effect of senescence on the decomposition of </w:t>
+      </w:r>
+      <w:r>
+        <w:rPr>
+          <w:rFonts w:ascii="Futura Medium" w:eastAsiaTheme="minorEastAsia" w:hAnsi="Futura Medium" w:cs="Futura Medium" w:hint="cs"/>
+          <w:i/>
+          <w:iCs/>
+          <w:sz w:val="20"/>
+          <w:szCs w:val="20"/>
+        </w:rPr>
+        <w:t xml:space="preserve">Macrocystis </w:t>
+      </w:r>
+      <w:proofErr w:type="spellStart"/>
+      <w:r>
+        <w:rPr>
+          <w:rFonts w:ascii="Futura Medium" w:eastAsiaTheme="minorEastAsia" w:hAnsi="Futura Medium" w:cs="Futura Medium" w:hint="cs"/>
+          <w:i/>
+          <w:iCs/>
+          <w:sz w:val="20"/>
+          <w:szCs w:val="20"/>
+        </w:rPr>
+        <w:t>pyrifera</w:t>
+      </w:r>
+      <w:proofErr w:type="spellEnd"/>
+      <w:r>
+        <w:rPr>
+          <w:rFonts w:ascii="Futura Medium" w:eastAsiaTheme="minorEastAsia" w:hAnsi="Futura Medium" w:cs="Futura Medium" w:hint="cs"/>
+          <w:sz w:val="20"/>
+          <w:szCs w:val="20"/>
+        </w:rPr>
+        <w:t xml:space="preserve"> (</w:t>
+      </w:r>
+      <w:r>
+        <w:rPr>
+          <w:rFonts w:ascii="Futura Medium" w:eastAsiaTheme="minorEastAsia" w:hAnsi="Futura Medium" w:cs="Futura Medium" w:hint="cs"/>
+          <w:b/>
+          <w:bCs/>
+          <w:sz w:val="20"/>
+          <w:szCs w:val="20"/>
+        </w:rPr>
+        <w:t>a</w:t>
+      </w:r>
+      <w:r>
+        <w:rPr>
+          <w:rFonts w:ascii="Futura Medium" w:eastAsiaTheme="minorEastAsia" w:hAnsi="Futura Medium" w:cs="Futura Medium" w:hint="cs"/>
+          <w:sz w:val="20"/>
+          <w:szCs w:val="20"/>
+        </w:rPr>
+        <w:t xml:space="preserve">, data from </w:t>
+      </w:r>
+      <w:r>
+        <w:rPr>
+          <w:rFonts w:ascii="Futura Medium" w:eastAsiaTheme="minorEastAsia" w:hAnsi="Futura Medium" w:cs="Futura Medium" w:hint="cs"/>
+          <w:sz w:val="20"/>
+          <w:szCs w:val="20"/>
+        </w:rPr>
+        <w:fldChar w:fldCharType="begin"/>
+      </w:r>
+      <w:r>
+        <w:rPr>
+          <w:rFonts w:ascii="Futura Medium" w:eastAsiaTheme="minorEastAsia" w:hAnsi="Futura Medium" w:cs="Futura Medium" w:hint="cs"/>
+          <w:sz w:val="20"/>
+          <w:szCs w:val="20"/>
+        </w:rPr>
+        <w:instrText>ADDIN BEC{Hamersley et al., 2015, #100187}</w:instrText>
+      </w:r>
+      <w:r>
+        <w:rPr>
+          <w:rFonts w:ascii="Futura Medium" w:eastAsiaTheme="minorEastAsia" w:hAnsi="Futura Medium" w:cs="Futura Medium" w:hint="cs"/>
+          <w:sz w:val="20"/>
+          <w:szCs w:val="20"/>
+        </w:rPr>
+        <w:fldChar w:fldCharType="separate"/>
+      </w:r>
+      <w:r>
+        <w:rPr>
+          <w:rFonts w:ascii="Futura Medium" w:eastAsiaTheme="minorEastAsia" w:hAnsi="Futura Medium" w:cs="Futura Medium" w:hint="cs"/>
+          <w:sz w:val="20"/>
+          <w:szCs w:val="20"/>
+        </w:rPr>
+        <w:t>Hamersley et al., 2015)</w:t>
+      </w:r>
+      <w:r>
+        <w:rPr>
+          <w:rFonts w:ascii="Futura Medium" w:eastAsiaTheme="minorEastAsia" w:hAnsi="Futura Medium" w:cs="Futura Medium" w:hint="cs"/>
+          <w:sz w:val="20"/>
+          <w:szCs w:val="20"/>
+        </w:rPr>
+        <w:fldChar w:fldCharType="end"/>
+      </w:r>
+      <w:r>
+        <w:rPr>
+          <w:rFonts w:ascii="Futura Medium" w:eastAsiaTheme="minorEastAsia" w:hAnsi="Futura Medium" w:cs="Futura Medium" w:hint="cs"/>
+          <w:sz w:val="20"/>
+          <w:szCs w:val="20"/>
+        </w:rPr>
+        <w:t xml:space="preserve"> and </w:t>
+      </w:r>
+      <w:r>
+        <w:rPr>
+          <w:rFonts w:ascii="Futura Medium" w:eastAsiaTheme="minorEastAsia" w:hAnsi="Futura Medium" w:cs="Futura Medium" w:hint="cs"/>
+          <w:i/>
+          <w:iCs/>
+          <w:sz w:val="20"/>
+          <w:szCs w:val="20"/>
+        </w:rPr>
+        <w:t xml:space="preserve">Laminaria </w:t>
+      </w:r>
+      <w:proofErr w:type="spellStart"/>
+      <w:r>
+        <w:rPr>
+          <w:rFonts w:ascii="Futura Medium" w:eastAsiaTheme="minorEastAsia" w:hAnsi="Futura Medium" w:cs="Futura Medium" w:hint="cs"/>
+          <w:i/>
+          <w:iCs/>
+          <w:sz w:val="20"/>
+          <w:szCs w:val="20"/>
+        </w:rPr>
+        <w:t>hyperborea</w:t>
+      </w:r>
+      <w:proofErr w:type="spellEnd"/>
+      <w:r>
+        <w:rPr>
+          <w:rFonts w:ascii="Futura Medium" w:eastAsiaTheme="minorEastAsia" w:hAnsi="Futura Medium" w:cs="Futura Medium" w:hint="cs"/>
+          <w:sz w:val="20"/>
+          <w:szCs w:val="20"/>
+        </w:rPr>
+        <w:t xml:space="preserve"> (</w:t>
+      </w:r>
+      <w:r>
+        <w:rPr>
+          <w:rFonts w:ascii="Futura Medium" w:eastAsiaTheme="minorEastAsia" w:hAnsi="Futura Medium" w:cs="Futura Medium" w:hint="cs"/>
+          <w:b/>
+          <w:bCs/>
+          <w:sz w:val="20"/>
+          <w:szCs w:val="20"/>
+        </w:rPr>
+        <w:t>b</w:t>
+      </w:r>
+      <w:r>
+        <w:rPr>
+          <w:rFonts w:ascii="Futura Medium" w:eastAsiaTheme="minorEastAsia" w:hAnsi="Futura Medium" w:cs="Futura Medium" w:hint="cs"/>
+          <w:sz w:val="20"/>
+          <w:szCs w:val="20"/>
+        </w:rPr>
+        <w:t xml:space="preserve">, data from </w:t>
+      </w:r>
+      <w:r>
+        <w:rPr>
+          <w:rFonts w:ascii="Futura Medium" w:eastAsiaTheme="minorEastAsia" w:hAnsi="Futura Medium" w:cs="Futura Medium" w:hint="cs"/>
+          <w:sz w:val="20"/>
+          <w:szCs w:val="20"/>
+        </w:rPr>
+        <w:fldChar w:fldCharType="begin"/>
+      </w:r>
+      <w:r>
+        <w:rPr>
+          <w:rFonts w:ascii="Futura Medium" w:eastAsiaTheme="minorEastAsia" w:hAnsi="Futura Medium" w:cs="Futura Medium" w:hint="cs"/>
+          <w:sz w:val="20"/>
+          <w:szCs w:val="20"/>
+        </w:rPr>
+        <w:instrText>ADDIN BEC{de Bettignies et al., 2020, #27484}</w:instrText>
+      </w:r>
+      <w:r>
+        <w:rPr>
+          <w:rFonts w:ascii="Futura Medium" w:eastAsiaTheme="minorEastAsia" w:hAnsi="Futura Medium" w:cs="Futura Medium" w:hint="cs"/>
+          <w:sz w:val="20"/>
+          <w:szCs w:val="20"/>
+        </w:rPr>
+        <w:fldChar w:fldCharType="separate"/>
+      </w:r>
+      <w:r>
+        <w:rPr>
+          <w:rFonts w:ascii="Futura Medium" w:eastAsiaTheme="minorEastAsia" w:hAnsi="Futura Medium" w:cs="Futura Medium" w:hint="cs"/>
+          <w:sz w:val="20"/>
+          <w:szCs w:val="20"/>
+        </w:rPr>
+        <w:t xml:space="preserve">de </w:t>
+      </w:r>
+      <w:proofErr w:type="spellStart"/>
+      <w:r>
+        <w:rPr>
+          <w:rFonts w:ascii="Futura Medium" w:eastAsiaTheme="minorEastAsia" w:hAnsi="Futura Medium" w:cs="Futura Medium" w:hint="cs"/>
+          <w:sz w:val="20"/>
+          <w:szCs w:val="20"/>
+        </w:rPr>
+        <w:t>Bettignies</w:t>
+      </w:r>
+      <w:proofErr w:type="spellEnd"/>
+      <w:r>
+        <w:rPr>
+          <w:rFonts w:ascii="Futura Medium" w:eastAsiaTheme="minorEastAsia" w:hAnsi="Futura Medium" w:cs="Futura Medium" w:hint="cs"/>
+          <w:sz w:val="20"/>
+          <w:szCs w:val="20"/>
+        </w:rPr>
+        <w:t xml:space="preserve"> et al., 2020)</w:t>
+      </w:r>
+      <w:r>
+        <w:rPr>
+          <w:rFonts w:ascii="Futura Medium" w:eastAsiaTheme="minorEastAsia" w:hAnsi="Futura Medium" w:cs="Futura Medium" w:hint="cs"/>
+          <w:sz w:val="20"/>
+          <w:szCs w:val="20"/>
+        </w:rPr>
+        <w:fldChar w:fldCharType="end"/>
+      </w:r>
+      <w:r>
+        <w:rPr>
+          <w:rFonts w:ascii="Futura Medium" w:eastAsiaTheme="minorEastAsia" w:hAnsi="Futura Medium" w:cs="Futura Medium" w:hint="cs"/>
+          <w:sz w:val="20"/>
+          <w:szCs w:val="20"/>
+        </w:rPr>
+        <w:t xml:space="preserve">, shown as the proportion of remaining mass over time </w:t>
+      </w:r>
+      <w:r>
+        <w:rPr>
+          <w:rFonts w:ascii="Futura Medium" w:eastAsiaTheme="minorEastAsia" w:hAnsi="Futura Medium" w:cs="Futura Medium" w:hint="cs"/>
+          <w:i/>
+          <w:iCs/>
+          <w:sz w:val="20"/>
+          <w:szCs w:val="20"/>
+        </w:rPr>
+        <w:t>t</w:t>
+      </w:r>
+      <w:r>
+        <w:rPr>
+          <w:rFonts w:ascii="Futura Medium" w:eastAsiaTheme="minorEastAsia" w:hAnsi="Futura Medium" w:cs="Futura Medium" w:hint="cs"/>
+          <w:sz w:val="20"/>
+          <w:szCs w:val="20"/>
+        </w:rPr>
+        <w:t>.</w:t>
+      </w:r>
+      <w:r>
+        <w:rPr>
+          <w:rFonts w:ascii="Futura Medium" w:hAnsi="Futura Medium" w:cs="Futura Medium" w:hint="cs"/>
+          <w:sz w:val="20"/>
+          <w:szCs w:val="20"/>
+        </w:rPr>
+        <w:t xml:space="preserve"> </w:t>
+      </w:r>
+      <w:r>
+        <w:rPr>
+          <w:rFonts w:ascii="Futura Medium" w:eastAsiaTheme="minorEastAsia" w:hAnsi="Futura Medium" w:cs="Futura Medium" w:hint="cs"/>
+          <w:sz w:val="20"/>
+          <w:szCs w:val="20"/>
+        </w:rPr>
+        <w:t xml:space="preserve">Data are plotted alongside macroalgal model predictions </w:t>
+      </w:r>
+      <w:r>
+        <w:rPr>
+          <w:rFonts w:ascii="Futura Medium" w:hAnsi="Futura Medium" w:cs="Futura Medium" w:hint="cs"/>
+          <w:sz w:val="20"/>
+          <w:szCs w:val="20"/>
+        </w:rPr>
+        <w:t xml:space="preserve">(cf. Figure S3) </w:t>
+      </w:r>
+      <w:r>
+        <w:rPr>
+          <w:rFonts w:ascii="Futura Medium" w:eastAsiaTheme="minorEastAsia" w:hAnsi="Futura Medium" w:cs="Futura Medium" w:hint="cs"/>
+          <w:sz w:val="20"/>
+          <w:szCs w:val="20"/>
+        </w:rPr>
+        <w:t xml:space="preserve">of </w:t>
+      </w:r>
+      <w:r>
+        <w:rPr>
+          <w:rFonts w:ascii="Futura Medium" w:eastAsiaTheme="minorEastAsia" w:hAnsi="Futura Medium" w:cs="Futura Medium" w:hint="cs"/>
+          <w:sz w:val="20"/>
+          <w:szCs w:val="20"/>
+          <w:lang w:bidi="he-IL"/>
+        </w:rPr>
+        <w:t>the mean (</w:t>
+      </w:r>
+      <w:r>
+        <w:rPr>
+          <w:rFonts w:ascii="Futura Medium" w:eastAsiaTheme="minorEastAsia" w:hAnsi="Futura Medium" w:cs="Futura Medium" w:hint="cs"/>
+          <w:i/>
+          <w:iCs/>
+          <w:sz w:val="20"/>
+          <w:szCs w:val="20"/>
+        </w:rPr>
+        <w:t>µ</w:t>
+      </w:r>
+      <w:r>
+        <w:rPr>
+          <w:rFonts w:ascii="Futura Medium" w:eastAsiaTheme="minorEastAsia" w:hAnsi="Futura Medium" w:cs="Futura Medium" w:hint="cs"/>
+          <w:i/>
+          <w:iCs/>
+          <w:sz w:val="20"/>
+          <w:szCs w:val="20"/>
+          <w:vertAlign w:val="subscript"/>
+        </w:rPr>
+        <w:t>m</w:t>
+      </w:r>
+      <w:r>
+        <w:rPr>
+          <w:rFonts w:ascii="Futura Medium" w:eastAsiaTheme="minorEastAsia" w:hAnsi="Futura Medium" w:cs="Futura Medium" w:hint="cs"/>
+          <w:sz w:val="20"/>
+          <w:szCs w:val="20"/>
+          <w:lang w:bidi="he-IL"/>
+        </w:rPr>
+        <w:t>) and the exponential decay rate (</w:t>
+      </w:r>
+      <w:r>
+        <w:rPr>
+          <w:rFonts w:ascii="Futura Medium" w:eastAsiaTheme="minorEastAsia" w:hAnsi="Futura Medium" w:cs="Futura Medium" w:hint="cs"/>
+          <w:i/>
+          <w:iCs/>
+          <w:sz w:val="20"/>
+          <w:szCs w:val="20"/>
+          <w:lang w:bidi="he-IL"/>
+        </w:rPr>
+        <w:t>k</w:t>
+      </w:r>
+      <w:r>
+        <w:rPr>
+          <w:rFonts w:ascii="Futura Medium" w:eastAsiaTheme="minorEastAsia" w:hAnsi="Futura Medium" w:cs="Futura Medium" w:hint="cs"/>
+          <w:sz w:val="20"/>
+          <w:szCs w:val="20"/>
+          <w:lang w:bidi="he-IL"/>
+        </w:rPr>
+        <w:t xml:space="preserve">) (Equation 12). </w:t>
+      </w:r>
+      <w:r>
+        <w:rPr>
+          <w:rFonts w:ascii="Futura Medium" w:eastAsiaTheme="minorEastAsia" w:hAnsi="Futura Medium" w:cs="Futura Medium" w:hint="cs"/>
+          <w:sz w:val="20"/>
+          <w:szCs w:val="20"/>
+        </w:rPr>
+        <w:t xml:space="preserve">Points with error bars denote mean ± standard deviation of 5 samples. Points without error bars are 1 sample. </w:t>
+      </w:r>
+      <w:r>
+        <w:rPr>
+          <w:rFonts w:ascii="Futura Medium" w:hAnsi="Futura Medium" w:cs="Futura Medium" w:hint="cs"/>
+          <w:sz w:val="20"/>
+          <w:szCs w:val="20"/>
+        </w:rPr>
+        <w:t>Lines and intervals are medians and the central 50, 80 and 90% of posterior probability.</w:t>
       </w:r>
     </w:p>
     <w:p>
@@ -7748,6 +8165,59 @@
       </w:pPr>
       <w:r>
         <w:rPr>
+          <w:rFonts w:ascii="Futura Medium" w:hAnsi="Futura Medium" w:cs="Futura Medium"/>
+          <w:noProof/>
+          <w:sz w:val="20"/>
+          <w:szCs w:val="20"/>
+        </w:rPr>
+        <w:lastRenderedPageBreak/>
+        <w:drawing>
+          <wp:inline distT="0" distB="0" distL="0" distR="0" wp14:anchorId="742A715F" wp14:editId="626C3CD9">
+            <wp:extent cx="2880000" cy="2880000"/>
+            <wp:effectExtent l="0" t="0" r="3175" b="3175"/>
+            <wp:docPr id="2208173" name="Picture 3"/>
+            <wp:cNvGraphicFramePr>
+              <a:graphicFrameLocks xmlns:a="http://schemas.openxmlformats.org/drawingml/2006/main" noChangeAspect="1"/>
+            </wp:cNvGraphicFramePr>
+            <a:graphic xmlns:a="http://schemas.openxmlformats.org/drawingml/2006/main">
+              <a:graphicData uri="http://schemas.openxmlformats.org/drawingml/2006/picture">
+                <pic:pic xmlns:pic="http://schemas.openxmlformats.org/drawingml/2006/picture">
+                  <pic:nvPicPr>
+                    <pic:cNvPr id="2208173" name="Picture 2208173"/>
+                    <pic:cNvPicPr/>
+                  </pic:nvPicPr>
+                  <pic:blipFill>
+                    <a:blip r:embed="rId13"/>
+                    <a:stretch>
+                      <a:fillRect/>
+                    </a:stretch>
+                  </pic:blipFill>
+                  <pic:spPr>
+                    <a:xfrm>
+                      <a:off x="0" y="0"/>
+                      <a:ext cx="2880000" cy="2880000"/>
+                    </a:xfrm>
+                    <a:prstGeom prst="rect">
+                      <a:avLst/>
+                    </a:prstGeom>
+                  </pic:spPr>
+                </pic:pic>
+              </a:graphicData>
+            </a:graphic>
+          </wp:inline>
+        </w:drawing>
+      </w:r>
+    </w:p>
+    <w:p>
+      <w:pPr>
+        <w:rPr>
+          <w:rFonts w:ascii="Futura Medium" w:hAnsi="Futura Medium" w:cs="Futura Medium"/>
+          <w:sz w:val="20"/>
+          <w:szCs w:val="20"/>
+        </w:rPr>
+      </w:pPr>
+      <w:r>
+        <w:rPr>
           <w:rFonts w:ascii="Futura" w:hAnsi="Futura" w:cs="Futura"/>
           <w:b/>
           <w:bCs/>
@@ -7758,11 +8228,196 @@
       </w:r>
       <w:r>
         <w:rPr>
-          <w:rFonts w:ascii="Futura Medium" w:hAnsi="Futura Medium" w:cs="Futura Medium"/>
+          <w:rFonts w:ascii="Futura Medium" w:hAnsi="Futura Medium" w:cs="Futura Medium" w:hint="cs"/>
           <w:sz w:val="20"/>
           <w:szCs w:val="20"/>
         </w:rPr>
         <w:t>.</w:t>
+      </w:r>
+      <w:r>
+        <w:rPr>
+          <w:rFonts w:ascii="Futura Medium" w:eastAsiaTheme="minorEastAsia" w:hAnsi="Futura Medium" w:cs="Futura Medium" w:hint="cs"/>
+          <w:sz w:val="20"/>
+          <w:szCs w:val="20"/>
+        </w:rPr>
+        <w:t xml:space="preserve"> </w:t>
+      </w:r>
+      <w:r>
+        <w:rPr>
+          <w:rFonts w:ascii="Futura Medium" w:eastAsiaTheme="minorEastAsia" w:hAnsi="Futura Medium" w:cs="Futura Medium" w:hint="cs"/>
+          <w:sz w:val="20"/>
+          <w:szCs w:val="20"/>
+        </w:rPr>
+        <w:t xml:space="preserve">Example 3: the effect of season on the decomposition of </w:t>
+      </w:r>
+      <w:proofErr w:type="spellStart"/>
+      <w:r>
+        <w:rPr>
+          <w:rFonts w:ascii="Futura Medium" w:eastAsiaTheme="minorEastAsia" w:hAnsi="Futura Medium" w:cs="Futura Medium" w:hint="cs"/>
+          <w:i/>
+          <w:iCs/>
+          <w:sz w:val="20"/>
+          <w:szCs w:val="20"/>
+        </w:rPr>
+        <w:t>Ulvaria</w:t>
+      </w:r>
+      <w:proofErr w:type="spellEnd"/>
+      <w:r>
+        <w:rPr>
+          <w:rFonts w:ascii="Futura Medium" w:eastAsiaTheme="minorEastAsia" w:hAnsi="Futura Medium" w:cs="Futura Medium" w:hint="cs"/>
+          <w:i/>
+          <w:iCs/>
+          <w:sz w:val="20"/>
+          <w:szCs w:val="20"/>
+        </w:rPr>
+        <w:t xml:space="preserve"> obscura</w:t>
+      </w:r>
+      <w:r>
+        <w:rPr>
+          <w:rFonts w:ascii="Futura Medium" w:eastAsiaTheme="minorEastAsia" w:hAnsi="Futura Medium" w:cs="Futura Medium" w:hint="cs"/>
+          <w:sz w:val="20"/>
+          <w:szCs w:val="20"/>
+        </w:rPr>
+        <w:t xml:space="preserve"> (data from </w:t>
+      </w:r>
+      <w:r>
+        <w:rPr>
+          <w:rFonts w:ascii="Futura Medium" w:eastAsiaTheme="minorEastAsia" w:hAnsi="Futura Medium" w:cs="Futura Medium" w:hint="cs"/>
+          <w:sz w:val="20"/>
+          <w:szCs w:val="20"/>
+        </w:rPr>
+        <w:fldChar w:fldCharType="begin"/>
+      </w:r>
+      <w:r>
+        <w:rPr>
+          <w:rFonts w:ascii="Futura Medium" w:eastAsiaTheme="minorEastAsia" w:hAnsi="Futura Medium" w:cs="Futura Medium" w:hint="cs"/>
+          <w:sz w:val="20"/>
+          <w:szCs w:val="20"/>
+        </w:rPr>
+        <w:instrText>ADDIN BEC{Bourguès et al., 1996, #24871}</w:instrText>
+      </w:r>
+      <w:r>
+        <w:rPr>
+          <w:rFonts w:ascii="Futura Medium" w:eastAsiaTheme="minorEastAsia" w:hAnsi="Futura Medium" w:cs="Futura Medium" w:hint="cs"/>
+          <w:sz w:val="20"/>
+          <w:szCs w:val="20"/>
+        </w:rPr>
+        <w:fldChar w:fldCharType="separate"/>
+      </w:r>
+      <w:proofErr w:type="spellStart"/>
+      <w:r>
+        <w:rPr>
+          <w:rFonts w:ascii="Futura Medium" w:eastAsiaTheme="minorEastAsia" w:hAnsi="Futura Medium" w:cs="Futura Medium" w:hint="cs"/>
+          <w:sz w:val="20"/>
+          <w:szCs w:val="20"/>
+        </w:rPr>
+        <w:t>Bourguès</w:t>
+      </w:r>
+      <w:proofErr w:type="spellEnd"/>
+      <w:r>
+        <w:rPr>
+          <w:rFonts w:ascii="Futura Medium" w:eastAsiaTheme="minorEastAsia" w:hAnsi="Futura Medium" w:cs="Futura Medium" w:hint="cs"/>
+          <w:sz w:val="20"/>
+          <w:szCs w:val="20"/>
+        </w:rPr>
+        <w:t xml:space="preserve"> et al., 1996)</w:t>
+      </w:r>
+      <w:r>
+        <w:rPr>
+          <w:rFonts w:ascii="Futura Medium" w:eastAsiaTheme="minorEastAsia" w:hAnsi="Futura Medium" w:cs="Futura Medium" w:hint="cs"/>
+          <w:sz w:val="20"/>
+          <w:szCs w:val="20"/>
+        </w:rPr>
+        <w:fldChar w:fldCharType="end"/>
+      </w:r>
+      <w:r>
+        <w:rPr>
+          <w:rFonts w:ascii="Futura Medium" w:eastAsiaTheme="minorEastAsia" w:hAnsi="Futura Medium" w:cs="Futura Medium" w:hint="cs"/>
+          <w:sz w:val="20"/>
+          <w:szCs w:val="20"/>
+        </w:rPr>
+        <w:t>.</w:t>
+      </w:r>
+      <w:r>
+        <w:rPr>
+          <w:rFonts w:ascii="Futura Medium" w:eastAsiaTheme="minorEastAsia" w:hAnsi="Futura Medium" w:cs="Futura Medium" w:hint="cs"/>
+          <w:sz w:val="20"/>
+          <w:szCs w:val="20"/>
+          <w:lang w:bidi="he-IL"/>
+        </w:rPr>
+        <w:t xml:space="preserve"> </w:t>
+      </w:r>
+      <w:r>
+        <w:rPr>
+          <w:rFonts w:ascii="Futura Medium" w:eastAsiaTheme="minorEastAsia" w:hAnsi="Futura Medium" w:cs="Futura Medium" w:hint="cs"/>
+          <w:sz w:val="20"/>
+          <w:szCs w:val="20"/>
+        </w:rPr>
+        <w:t xml:space="preserve">Data are plotted alongside macroalgal model predictions </w:t>
+      </w:r>
+      <w:r>
+        <w:rPr>
+          <w:rFonts w:ascii="Futura Medium" w:hAnsi="Futura Medium" w:cs="Futura Medium" w:hint="cs"/>
+          <w:sz w:val="20"/>
+          <w:szCs w:val="20"/>
+        </w:rPr>
+        <w:t xml:space="preserve">(cf. Figure S4) </w:t>
+      </w:r>
+      <w:r>
+        <w:rPr>
+          <w:rFonts w:ascii="Futura Medium" w:eastAsiaTheme="minorEastAsia" w:hAnsi="Futura Medium" w:cs="Futura Medium" w:hint="cs"/>
+          <w:sz w:val="20"/>
+          <w:szCs w:val="20"/>
+        </w:rPr>
+        <w:t>of new observations (</w:t>
+      </w:r>
+      <m:oMath>
+        <m:acc>
+          <m:accPr>
+            <m:chr m:val="̃"/>
+            <m:ctrlPr>
+              <w:rPr>
+                <w:rFonts w:ascii="Cambria Math" w:eastAsiaTheme="minorEastAsia" w:hAnsi="Cambria Math" w:cs="Futura Medium" w:hint="cs"/>
+                <w:i/>
+                <w:sz w:val="20"/>
+                <w:szCs w:val="20"/>
+              </w:rPr>
+            </m:ctrlPr>
+          </m:accPr>
+          <m:e>
+            <m:r>
+              <m:rPr>
+                <m:nor/>
+              </m:rPr>
+              <w:rPr>
+                <w:rFonts w:ascii="Futura Medium" w:eastAsiaTheme="minorEastAsia" w:hAnsi="Futura Medium" w:cs="Futura Medium" w:hint="cs"/>
+                <w:i/>
+                <w:iCs/>
+                <w:sz w:val="20"/>
+                <w:szCs w:val="20"/>
+                <w:lang w:bidi="he-IL"/>
+              </w:rPr>
+              <m:t>m</m:t>
+            </m:r>
+          </m:e>
+        </m:acc>
+      </m:oMath>
+      <w:r>
+        <w:rPr>
+          <w:rFonts w:ascii="Futura Medium" w:eastAsiaTheme="minorEastAsia" w:hAnsi="Futura Medium" w:cs="Futura Medium" w:hint="cs"/>
+          <w:sz w:val="20"/>
+          <w:szCs w:val="20"/>
+          <w:lang w:bidi="he-IL"/>
+        </w:rPr>
+        <w:t xml:space="preserve">, Equation 12). </w:t>
+      </w:r>
+      <w:r>
+        <w:rPr>
+          <w:rFonts w:ascii="Futura Medium" w:hAnsi="Futura Medium" w:cs="Futura Medium" w:hint="cs"/>
+          <w:sz w:val="20"/>
+          <w:szCs w:val="20"/>
+        </w:rPr>
+        <w:t>Lines and intervals are medians and the central 50, 80 and 90% of posterior probability.</w:t>
       </w:r>
     </w:p>
     <w:p>
@@ -7793,6 +8448,58 @@
       </w:pPr>
       <w:r>
         <w:rPr>
+          <w:rFonts w:ascii="Futura Medium" w:hAnsi="Futura Medium" w:cs="Futura Medium"/>
+          <w:noProof/>
+          <w:sz w:val="20"/>
+          <w:szCs w:val="20"/>
+        </w:rPr>
+        <w:drawing>
+          <wp:inline distT="0" distB="0" distL="0" distR="0" wp14:anchorId="3F374EDB" wp14:editId="35B01FD9">
+            <wp:extent cx="5760000" cy="2880000"/>
+            <wp:effectExtent l="0" t="0" r="6350" b="3175"/>
+            <wp:docPr id="1746727515" name="Picture 4"/>
+            <wp:cNvGraphicFramePr>
+              <a:graphicFrameLocks xmlns:a="http://schemas.openxmlformats.org/drawingml/2006/main" noChangeAspect="1"/>
+            </wp:cNvGraphicFramePr>
+            <a:graphic xmlns:a="http://schemas.openxmlformats.org/drawingml/2006/main">
+              <a:graphicData uri="http://schemas.openxmlformats.org/drawingml/2006/picture">
+                <pic:pic xmlns:pic="http://schemas.openxmlformats.org/drawingml/2006/picture">
+                  <pic:nvPicPr>
+                    <pic:cNvPr id="1746727515" name="Picture 1746727515"/>
+                    <pic:cNvPicPr/>
+                  </pic:nvPicPr>
+                  <pic:blipFill>
+                    <a:blip r:embed="rId14"/>
+                    <a:stretch>
+                      <a:fillRect/>
+                    </a:stretch>
+                  </pic:blipFill>
+                  <pic:spPr>
+                    <a:xfrm>
+                      <a:off x="0" y="0"/>
+                      <a:ext cx="5760000" cy="2880000"/>
+                    </a:xfrm>
+                    <a:prstGeom prst="rect">
+                      <a:avLst/>
+                    </a:prstGeom>
+                  </pic:spPr>
+                </pic:pic>
+              </a:graphicData>
+            </a:graphic>
+          </wp:inline>
+        </w:drawing>
+      </w:r>
+    </w:p>
+    <w:p>
+      <w:pPr>
+        <w:rPr>
+          <w:rFonts w:ascii="Futura Medium" w:hAnsi="Futura Medium" w:cs="Futura Medium"/>
+          <w:sz w:val="20"/>
+          <w:szCs w:val="20"/>
+        </w:rPr>
+      </w:pPr>
+      <w:r>
+        <w:rPr>
           <w:rFonts w:ascii="Futura" w:hAnsi="Futura" w:cs="Futura"/>
           <w:b/>
           <w:bCs/>
@@ -7803,11 +8510,354 @@
       </w:r>
       <w:r>
         <w:rPr>
-          <w:rFonts w:ascii="Futura Medium" w:hAnsi="Futura Medium" w:cs="Futura Medium"/>
+          <w:rFonts w:ascii="Futura Medium" w:hAnsi="Futura Medium" w:cs="Futura Medium" w:hint="cs"/>
           <w:sz w:val="20"/>
           <w:szCs w:val="20"/>
         </w:rPr>
         <w:t>.</w:t>
+      </w:r>
+      <w:r>
+        <w:rPr>
+          <w:rFonts w:ascii="Futura Medium" w:eastAsiaTheme="minorEastAsia" w:hAnsi="Futura Medium" w:cs="Futura Medium" w:hint="cs"/>
+          <w:sz w:val="20"/>
+          <w:szCs w:val="20"/>
+        </w:rPr>
+        <w:t xml:space="preserve"> </w:t>
+      </w:r>
+      <w:r>
+        <w:rPr>
+          <w:rFonts w:ascii="Futura Medium" w:eastAsiaTheme="minorEastAsia" w:hAnsi="Futura Medium" w:cs="Futura Medium" w:hint="cs"/>
+          <w:sz w:val="20"/>
+          <w:szCs w:val="20"/>
+        </w:rPr>
+        <w:t xml:space="preserve">Example 4: the effect of light attenuation with depth on the decomposition of </w:t>
+      </w:r>
+      <w:r>
+        <w:rPr>
+          <w:rFonts w:ascii="Futura Medium" w:eastAsiaTheme="minorEastAsia" w:hAnsi="Futura Medium" w:cs="Futura Medium" w:hint="cs"/>
+          <w:i/>
+          <w:iCs/>
+          <w:sz w:val="20"/>
+          <w:szCs w:val="20"/>
+        </w:rPr>
+        <w:t xml:space="preserve">Laminaria </w:t>
+      </w:r>
+      <w:proofErr w:type="spellStart"/>
+      <w:r>
+        <w:rPr>
+          <w:rFonts w:ascii="Futura Medium" w:eastAsiaTheme="minorEastAsia" w:hAnsi="Futura Medium" w:cs="Futura Medium" w:hint="cs"/>
+          <w:i/>
+          <w:iCs/>
+          <w:sz w:val="20"/>
+          <w:szCs w:val="20"/>
+        </w:rPr>
+        <w:t>hyperborea</w:t>
+      </w:r>
+      <w:proofErr w:type="spellEnd"/>
+      <w:r>
+        <w:rPr>
+          <w:rFonts w:ascii="Futura Medium" w:eastAsiaTheme="minorEastAsia" w:hAnsi="Futura Medium" w:cs="Futura Medium" w:hint="cs"/>
+          <w:sz w:val="20"/>
+          <w:szCs w:val="20"/>
+        </w:rPr>
+        <w:t xml:space="preserve"> and </w:t>
+      </w:r>
+      <w:r>
+        <w:rPr>
+          <w:rFonts w:ascii="Futura Medium" w:eastAsiaTheme="minorEastAsia" w:hAnsi="Futura Medium" w:cs="Futura Medium" w:hint="cs"/>
+          <w:i/>
+          <w:iCs/>
+          <w:sz w:val="20"/>
+          <w:szCs w:val="20"/>
+        </w:rPr>
+        <w:t xml:space="preserve">Laminaria </w:t>
+      </w:r>
+      <w:proofErr w:type="spellStart"/>
+      <w:r>
+        <w:rPr>
+          <w:rFonts w:ascii="Futura Medium" w:eastAsiaTheme="minorEastAsia" w:hAnsi="Futura Medium" w:cs="Futura Medium" w:hint="cs"/>
+          <w:i/>
+          <w:iCs/>
+          <w:sz w:val="20"/>
+          <w:szCs w:val="20"/>
+        </w:rPr>
+        <w:t>ochroleuca</w:t>
+      </w:r>
+      <w:proofErr w:type="spellEnd"/>
+      <w:r>
+        <w:rPr>
+          <w:rFonts w:ascii="Futura Medium" w:eastAsiaTheme="minorEastAsia" w:hAnsi="Futura Medium" w:cs="Futura Medium" w:hint="cs"/>
+          <w:sz w:val="20"/>
+          <w:szCs w:val="20"/>
+        </w:rPr>
+        <w:t xml:space="preserve"> </w:t>
+      </w:r>
+      <w:r>
+        <w:rPr>
+          <w:rFonts w:ascii="Futura Medium" w:eastAsiaTheme="minorEastAsia" w:hAnsi="Futura Medium" w:cs="Futura Medium" w:hint="cs"/>
+          <w:i/>
+          <w:iCs/>
+          <w:sz w:val="20"/>
+          <w:szCs w:val="20"/>
+        </w:rPr>
+        <w:t>ex situ</w:t>
+      </w:r>
+      <w:r>
+        <w:rPr>
+          <w:rFonts w:ascii="Futura Medium" w:eastAsiaTheme="minorEastAsia" w:hAnsi="Futura Medium" w:cs="Futura Medium" w:hint="cs"/>
+          <w:sz w:val="20"/>
+          <w:szCs w:val="20"/>
+        </w:rPr>
+        <w:t xml:space="preserve"> (</w:t>
+      </w:r>
+      <w:r>
+        <w:rPr>
+          <w:rFonts w:ascii="Futura Medium" w:eastAsiaTheme="minorEastAsia" w:hAnsi="Futura Medium" w:cs="Futura Medium" w:hint="cs"/>
+          <w:b/>
+          <w:bCs/>
+          <w:sz w:val="20"/>
+          <w:szCs w:val="20"/>
+        </w:rPr>
+        <w:t>a</w:t>
+      </w:r>
+      <w:r>
+        <w:rPr>
+          <w:rFonts w:ascii="Futura Medium" w:eastAsiaTheme="minorEastAsia" w:hAnsi="Futura Medium" w:cs="Futura Medium" w:hint="cs"/>
+          <w:sz w:val="20"/>
+          <w:szCs w:val="20"/>
+        </w:rPr>
+        <w:t xml:space="preserve">, data from </w:t>
+      </w:r>
+      <w:r>
+        <w:rPr>
+          <w:rFonts w:ascii="Futura Medium" w:eastAsiaTheme="minorEastAsia" w:hAnsi="Futura Medium" w:cs="Futura Medium" w:hint="cs"/>
+          <w:sz w:val="20"/>
+          <w:szCs w:val="20"/>
+        </w:rPr>
+        <w:fldChar w:fldCharType="begin"/>
+      </w:r>
+      <w:r>
+        <w:rPr>
+          <w:rFonts w:ascii="Futura Medium" w:eastAsiaTheme="minorEastAsia" w:hAnsi="Futura Medium" w:cs="Futura Medium" w:hint="cs"/>
+          <w:sz w:val="20"/>
+          <w:szCs w:val="20"/>
+        </w:rPr>
+        <w:instrText>ADDIN BEC{Frontier et al., 2021, #5570}</w:instrText>
+      </w:r>
+      <w:r>
+        <w:rPr>
+          <w:rFonts w:ascii="Futura Medium" w:eastAsiaTheme="minorEastAsia" w:hAnsi="Futura Medium" w:cs="Futura Medium" w:hint="cs"/>
+          <w:sz w:val="20"/>
+          <w:szCs w:val="20"/>
+        </w:rPr>
+        <w:fldChar w:fldCharType="separate"/>
+      </w:r>
+      <w:r>
+        <w:rPr>
+          <w:rFonts w:ascii="Futura Medium" w:eastAsiaTheme="minorEastAsia" w:hAnsi="Futura Medium" w:cs="Futura Medium" w:hint="cs"/>
+          <w:sz w:val="20"/>
+          <w:szCs w:val="20"/>
+        </w:rPr>
+        <w:t>Frontier et al., 2021)</w:t>
+      </w:r>
+      <w:r>
+        <w:rPr>
+          <w:rFonts w:ascii="Futura Medium" w:eastAsiaTheme="minorEastAsia" w:hAnsi="Futura Medium" w:cs="Futura Medium" w:hint="cs"/>
+          <w:sz w:val="20"/>
+          <w:szCs w:val="20"/>
+        </w:rPr>
+        <w:fldChar w:fldCharType="end"/>
+      </w:r>
+      <w:r>
+        <w:rPr>
+          <w:rFonts w:ascii="Futura Medium" w:eastAsiaTheme="minorEastAsia" w:hAnsi="Futura Medium" w:cs="Futura Medium" w:hint="cs"/>
+          <w:sz w:val="20"/>
+          <w:szCs w:val="20"/>
+        </w:rPr>
+        <w:t xml:space="preserve"> and </w:t>
+      </w:r>
+      <w:r>
+        <w:rPr>
+          <w:rFonts w:ascii="Futura Medium" w:eastAsiaTheme="minorEastAsia" w:hAnsi="Futura Medium" w:cs="Futura Medium" w:hint="cs"/>
+          <w:i/>
+          <w:iCs/>
+          <w:sz w:val="20"/>
+          <w:szCs w:val="20"/>
+        </w:rPr>
+        <w:t>in situ</w:t>
+      </w:r>
+      <w:r>
+        <w:rPr>
+          <w:rFonts w:ascii="Futura Medium" w:eastAsiaTheme="minorEastAsia" w:hAnsi="Futura Medium" w:cs="Futura Medium" w:hint="cs"/>
+          <w:sz w:val="20"/>
+          <w:szCs w:val="20"/>
+        </w:rPr>
+        <w:t xml:space="preserve"> (</w:t>
+      </w:r>
+      <w:r>
+        <w:rPr>
+          <w:rFonts w:ascii="Futura Medium" w:eastAsiaTheme="minorEastAsia" w:hAnsi="Futura Medium" w:cs="Futura Medium" w:hint="cs"/>
+          <w:b/>
+          <w:bCs/>
+          <w:sz w:val="20"/>
+          <w:szCs w:val="20"/>
+        </w:rPr>
+        <w:t>b</w:t>
+      </w:r>
+      <w:r>
+        <w:rPr>
+          <w:rFonts w:ascii="Futura Medium" w:eastAsiaTheme="minorEastAsia" w:hAnsi="Futura Medium" w:cs="Futura Medium" w:hint="cs"/>
+          <w:sz w:val="20"/>
+          <w:szCs w:val="20"/>
+        </w:rPr>
+        <w:t xml:space="preserve">, data from </w:t>
+      </w:r>
+      <w:r>
+        <w:rPr>
+          <w:rFonts w:ascii="Futura Medium" w:eastAsiaTheme="minorEastAsia" w:hAnsi="Futura Medium" w:cs="Futura Medium" w:hint="cs"/>
+          <w:sz w:val="20"/>
+          <w:szCs w:val="20"/>
+        </w:rPr>
+        <w:fldChar w:fldCharType="begin"/>
+      </w:r>
+      <w:r>
+        <w:rPr>
+          <w:rFonts w:ascii="Futura Medium" w:eastAsiaTheme="minorEastAsia" w:hAnsi="Futura Medium" w:cs="Futura Medium" w:hint="cs"/>
+          <w:sz w:val="20"/>
+          <w:szCs w:val="20"/>
+        </w:rPr>
+        <w:instrText>ADDIN BEC{Frontier et al., 2022, #81381}</w:instrText>
+      </w:r>
+      <w:r>
+        <w:rPr>
+          <w:rFonts w:ascii="Futura Medium" w:eastAsiaTheme="minorEastAsia" w:hAnsi="Futura Medium" w:cs="Futura Medium" w:hint="cs"/>
+          <w:sz w:val="20"/>
+          <w:szCs w:val="20"/>
+        </w:rPr>
+        <w:fldChar w:fldCharType="separate"/>
+      </w:r>
+      <w:r>
+        <w:rPr>
+          <w:rFonts w:ascii="Futura Medium" w:eastAsiaTheme="minorEastAsia" w:hAnsi="Futura Medium" w:cs="Futura Medium" w:hint="cs"/>
+          <w:sz w:val="20"/>
+          <w:szCs w:val="20"/>
+        </w:rPr>
+        <w:t>Frontier et al., 2022)</w:t>
+      </w:r>
+      <w:r>
+        <w:rPr>
+          <w:rFonts w:ascii="Futura Medium" w:eastAsiaTheme="minorEastAsia" w:hAnsi="Futura Medium" w:cs="Futura Medium" w:hint="cs"/>
+          <w:sz w:val="20"/>
+          <w:szCs w:val="20"/>
+        </w:rPr>
+        <w:fldChar w:fldCharType="end"/>
+      </w:r>
+      <w:r>
+        <w:rPr>
+          <w:rFonts w:ascii="Futura Medium" w:eastAsiaTheme="minorEastAsia" w:hAnsi="Futura Medium" w:cs="Futura Medium" w:hint="cs"/>
+          <w:sz w:val="20"/>
+          <w:szCs w:val="20"/>
+        </w:rPr>
+        <w:t xml:space="preserve">, shown as the proportion of remaining mass over time </w:t>
+      </w:r>
+      <w:r>
+        <w:rPr>
+          <w:rFonts w:ascii="Futura Medium" w:eastAsiaTheme="minorEastAsia" w:hAnsi="Futura Medium" w:cs="Futura Medium" w:hint="cs"/>
+          <w:i/>
+          <w:iCs/>
+          <w:sz w:val="20"/>
+          <w:szCs w:val="20"/>
+        </w:rPr>
+        <w:t>t</w:t>
+      </w:r>
+      <w:r>
+        <w:rPr>
+          <w:rFonts w:ascii="Futura Medium" w:eastAsiaTheme="minorEastAsia" w:hAnsi="Futura Medium" w:cs="Futura Medium" w:hint="cs"/>
+          <w:sz w:val="20"/>
+          <w:szCs w:val="20"/>
+        </w:rPr>
+        <w:t>.</w:t>
+      </w:r>
+      <w:r>
+        <w:rPr>
+          <w:rFonts w:ascii="Futura Medium" w:eastAsiaTheme="minorEastAsia" w:hAnsi="Futura Medium" w:cs="Futura Medium" w:hint="cs"/>
+          <w:sz w:val="20"/>
+          <w:szCs w:val="20"/>
+          <w:lang w:bidi="he-IL"/>
+        </w:rPr>
+        <w:t xml:space="preserve"> </w:t>
+      </w:r>
+      <w:r>
+        <w:rPr>
+          <w:rFonts w:ascii="Futura Medium" w:eastAsiaTheme="minorEastAsia" w:hAnsi="Futura Medium" w:cs="Futura Medium" w:hint="cs"/>
+          <w:sz w:val="20"/>
+          <w:szCs w:val="20"/>
+        </w:rPr>
+        <w:t xml:space="preserve">Data are plotted alongside macroalgal model predictions </w:t>
+      </w:r>
+      <w:r>
+        <w:rPr>
+          <w:rFonts w:ascii="Futura Medium" w:hAnsi="Futura Medium" w:cs="Futura Medium" w:hint="cs"/>
+          <w:sz w:val="20"/>
+          <w:szCs w:val="20"/>
+        </w:rPr>
+        <w:t xml:space="preserve">(cf. Figure S5) </w:t>
+      </w:r>
+      <w:r>
+        <w:rPr>
+          <w:rFonts w:ascii="Futura Medium" w:eastAsiaTheme="minorEastAsia" w:hAnsi="Futura Medium" w:cs="Futura Medium" w:hint="cs"/>
+          <w:sz w:val="20"/>
+          <w:szCs w:val="20"/>
+        </w:rPr>
+        <w:t>of new observations (</w:t>
+      </w:r>
+      <m:oMath>
+        <m:acc>
+          <m:accPr>
+            <m:chr m:val="̃"/>
+            <m:ctrlPr>
+              <w:rPr>
+                <w:rFonts w:ascii="Cambria Math" w:eastAsiaTheme="minorEastAsia" w:hAnsi="Cambria Math" w:cs="Futura Medium" w:hint="cs"/>
+                <w:i/>
+                <w:sz w:val="20"/>
+                <w:szCs w:val="20"/>
+              </w:rPr>
+            </m:ctrlPr>
+          </m:accPr>
+          <m:e>
+            <m:r>
+              <m:rPr>
+                <m:nor/>
+              </m:rPr>
+              <w:rPr>
+                <w:rFonts w:ascii="Futura Medium" w:eastAsiaTheme="minorEastAsia" w:hAnsi="Futura Medium" w:cs="Futura Medium" w:hint="cs"/>
+                <w:i/>
+                <w:iCs/>
+                <w:sz w:val="20"/>
+                <w:szCs w:val="20"/>
+                <w:lang w:bidi="he-IL"/>
+              </w:rPr>
+              <m:t>m</m:t>
+            </m:r>
+          </m:e>
+        </m:acc>
+      </m:oMath>
+      <w:r>
+        <w:rPr>
+          <w:rFonts w:ascii="Futura Medium" w:eastAsiaTheme="minorEastAsia" w:hAnsi="Futura Medium" w:cs="Futura Medium" w:hint="cs"/>
+          <w:sz w:val="20"/>
+          <w:szCs w:val="20"/>
+          <w:lang w:bidi="he-IL"/>
+        </w:rPr>
+        <w:t xml:space="preserve">, Equation 12). </w:t>
+      </w:r>
+      <w:r>
+        <w:rPr>
+          <w:rFonts w:ascii="Futura Medium" w:hAnsi="Futura Medium" w:cs="Futura Medium" w:hint="cs"/>
+          <w:sz w:val="20"/>
+          <w:szCs w:val="20"/>
+        </w:rPr>
+        <w:t>Lines and intervals are medians and the central 50, 80 and 90% of posterior probability.</w:t>
       </w:r>
     </w:p>
     <w:p>
@@ -7827,6 +8877,50 @@
           <w:szCs w:val="20"/>
         </w:rPr>
       </w:pPr>
+      <w:r>
+        <w:rPr>
+          <w:rFonts w:ascii="Futura Medium" w:hAnsi="Futura Medium" w:cs="Futura Medium"/>
+          <w:noProof/>
+          <w:sz w:val="20"/>
+          <w:szCs w:val="20"/>
+        </w:rPr>
+        <w:lastRenderedPageBreak/>
+        <w:drawing>
+          <wp:inline distT="0" distB="0" distL="0" distR="0" wp14:anchorId="16CE8454" wp14:editId="72B23D00">
+            <wp:extent cx="5760000" cy="3460084"/>
+            <wp:effectExtent l="0" t="0" r="0" b="0"/>
+            <wp:docPr id="1705454690" name="Picture 5"/>
+            <wp:cNvGraphicFramePr>
+              <a:graphicFrameLocks xmlns:a="http://schemas.openxmlformats.org/drawingml/2006/main" noChangeAspect="1"/>
+            </wp:cNvGraphicFramePr>
+            <a:graphic xmlns:a="http://schemas.openxmlformats.org/drawingml/2006/main">
+              <a:graphicData uri="http://schemas.openxmlformats.org/drawingml/2006/picture">
+                <pic:pic xmlns:pic="http://schemas.openxmlformats.org/drawingml/2006/picture">
+                  <pic:nvPicPr>
+                    <pic:cNvPr id="1705454690" name="Picture 1705454690"/>
+                    <pic:cNvPicPr/>
+                  </pic:nvPicPr>
+                  <pic:blipFill>
+                    <a:blip r:embed="rId15"/>
+                    <a:stretch>
+                      <a:fillRect/>
+                    </a:stretch>
+                  </pic:blipFill>
+                  <pic:spPr>
+                    <a:xfrm>
+                      <a:off x="0" y="0"/>
+                      <a:ext cx="5760000" cy="3460084"/>
+                    </a:xfrm>
+                    <a:prstGeom prst="rect">
+                      <a:avLst/>
+                    </a:prstGeom>
+                  </pic:spPr>
+                </pic:pic>
+              </a:graphicData>
+            </a:graphic>
+          </wp:inline>
+        </w:drawing>
+      </w:r>
     </w:p>
     <w:p>
       <w:pPr>
@@ -7848,11 +8942,127 @@
       </w:r>
       <w:r>
         <w:rPr>
-          <w:rFonts w:ascii="Futura Medium" w:hAnsi="Futura Medium" w:cs="Futura Medium"/>
+          <w:rFonts w:ascii="Futura Medium" w:hAnsi="Futura Medium" w:cs="Futura Medium" w:hint="cs"/>
           <w:sz w:val="20"/>
           <w:szCs w:val="20"/>
         </w:rPr>
         <w:t>.</w:t>
+      </w:r>
+      <w:r>
+        <w:rPr>
+          <w:rFonts w:ascii="Futura Medium" w:eastAsiaTheme="minorEastAsia" w:hAnsi="Futura Medium" w:cs="Futura Medium" w:hint="cs"/>
+          <w:sz w:val="20"/>
+          <w:szCs w:val="20"/>
+        </w:rPr>
+        <w:t xml:space="preserve"> </w:t>
+      </w:r>
+      <w:r>
+        <w:rPr>
+          <w:rFonts w:ascii="Futura Medium" w:eastAsiaTheme="minorEastAsia" w:hAnsi="Futura Medium" w:cs="Futura Medium" w:hint="cs"/>
+          <w:sz w:val="20"/>
+          <w:szCs w:val="20"/>
+        </w:rPr>
+        <w:t xml:space="preserve">Example 5: the effect of temperature and grazing on the decomposition of floating </w:t>
+      </w:r>
+      <w:r>
+        <w:rPr>
+          <w:rFonts w:ascii="Futura Medium" w:eastAsiaTheme="minorEastAsia" w:hAnsi="Futura Medium" w:cs="Futura Medium" w:hint="cs"/>
+          <w:i/>
+          <w:iCs/>
+          <w:sz w:val="20"/>
+          <w:szCs w:val="20"/>
+        </w:rPr>
+        <w:t>Ascophyllum nodosum</w:t>
+      </w:r>
+      <w:r>
+        <w:rPr>
+          <w:rFonts w:ascii="Futura Medium" w:eastAsiaTheme="minorEastAsia" w:hAnsi="Futura Medium" w:cs="Futura Medium" w:hint="cs"/>
+          <w:sz w:val="20"/>
+          <w:szCs w:val="20"/>
+        </w:rPr>
+        <w:t xml:space="preserve"> and </w:t>
+      </w:r>
+      <w:r>
+        <w:rPr>
+          <w:rFonts w:ascii="Futura Medium" w:eastAsiaTheme="minorEastAsia" w:hAnsi="Futura Medium" w:cs="Futura Medium" w:hint="cs"/>
+          <w:i/>
+          <w:iCs/>
+          <w:sz w:val="20"/>
+          <w:szCs w:val="20"/>
+        </w:rPr>
+        <w:t>Fucus vesiculosus</w:t>
+      </w:r>
+      <w:r>
+        <w:rPr>
+          <w:rFonts w:ascii="Futura Medium" w:eastAsiaTheme="minorEastAsia" w:hAnsi="Futura Medium" w:cs="Futura Medium" w:hint="cs"/>
+          <w:sz w:val="20"/>
+          <w:szCs w:val="20"/>
+        </w:rPr>
+        <w:t xml:space="preserve"> (data from {Vandendriessche et al., 2007, #8033}. Data are plotted alongside macroalgal model predictions </w:t>
+      </w:r>
+      <w:r>
+        <w:rPr>
+          <w:rFonts w:ascii="Futura Medium" w:hAnsi="Futura Medium" w:cs="Futura Medium" w:hint="cs"/>
+          <w:sz w:val="20"/>
+          <w:szCs w:val="20"/>
+        </w:rPr>
+        <w:t xml:space="preserve">(cf. Figure S6) </w:t>
+      </w:r>
+      <w:r>
+        <w:rPr>
+          <w:rFonts w:ascii="Futura Medium" w:eastAsiaTheme="minorEastAsia" w:hAnsi="Futura Medium" w:cs="Futura Medium" w:hint="cs"/>
+          <w:sz w:val="20"/>
+          <w:szCs w:val="20"/>
+        </w:rPr>
+        <w:t>of new observations (</w:t>
+      </w:r>
+      <m:oMath>
+        <m:acc>
+          <m:accPr>
+            <m:chr m:val="̃"/>
+            <m:ctrlPr>
+              <w:rPr>
+                <w:rFonts w:ascii="Cambria Math" w:eastAsiaTheme="minorEastAsia" w:hAnsi="Cambria Math" w:cs="Futura Medium" w:hint="cs"/>
+                <w:i/>
+                <w:sz w:val="20"/>
+                <w:szCs w:val="20"/>
+              </w:rPr>
+            </m:ctrlPr>
+          </m:accPr>
+          <m:e>
+            <m:r>
+              <m:rPr>
+                <m:nor/>
+              </m:rPr>
+              <w:rPr>
+                <w:rFonts w:ascii="Futura Medium" w:eastAsiaTheme="minorEastAsia" w:hAnsi="Futura Medium" w:cs="Futura Medium" w:hint="cs"/>
+                <w:i/>
+                <w:iCs/>
+                <w:sz w:val="20"/>
+                <w:szCs w:val="20"/>
+                <w:lang w:bidi="he-IL"/>
+              </w:rPr>
+              <m:t>m</m:t>
+            </m:r>
+          </m:e>
+        </m:acc>
+      </m:oMath>
+      <w:r>
+        <w:rPr>
+          <w:rFonts w:ascii="Futura Medium" w:eastAsiaTheme="minorEastAsia" w:hAnsi="Futura Medium" w:cs="Futura Medium" w:hint="cs"/>
+          <w:sz w:val="20"/>
+          <w:szCs w:val="20"/>
+          <w:lang w:bidi="he-IL"/>
+        </w:rPr>
+        <w:t xml:space="preserve">, Equation 12). </w:t>
+      </w:r>
+      <w:r>
+        <w:rPr>
+          <w:rFonts w:ascii="Futura Medium" w:hAnsi="Futura Medium" w:cs="Futura Medium" w:hint="cs"/>
+          <w:sz w:val="20"/>
+          <w:szCs w:val="20"/>
+        </w:rPr>
+        <w:t>Lines and intervals are medians and the central 50, 80 and 90% of posterior probability.</w:t>
       </w:r>
     </w:p>
     <w:p>
@@ -7864,53 +9074,9 @@
         </w:rPr>
       </w:pPr>
     </w:p>
-    <w:p>
-      <w:pPr>
-        <w:rPr>
-          <w:rFonts w:ascii="Futura Medium" w:hAnsi="Futura Medium" w:cs="Futura Medium"/>
-          <w:sz w:val="20"/>
-          <w:szCs w:val="20"/>
-        </w:rPr>
-      </w:pPr>
-      <w:r>
-        <w:rPr>
-          <w:rFonts w:ascii="Futura" w:hAnsi="Futura" w:cs="Futura"/>
-          <w:b/>
-          <w:bCs/>
-          <w:sz w:val="20"/>
-          <w:szCs w:val="20"/>
-        </w:rPr>
-        <w:t>Figure S7</w:t>
-      </w:r>
-      <w:r>
-        <w:rPr>
-          <w:rFonts w:ascii="Futura Medium" w:hAnsi="Futura Medium" w:cs="Futura Medium"/>
-          <w:sz w:val="20"/>
-          <w:szCs w:val="20"/>
-        </w:rPr>
-        <w:t>.</w:t>
-      </w:r>
-      <w:r>
-        <w:rPr>
-          <w:rFonts w:ascii="Futura Medium" w:hAnsi="Futura Medium" w:cs="Futura Medium"/>
-          <w:sz w:val="20"/>
-          <w:szCs w:val="20"/>
-        </w:rPr>
-        <w:t xml:space="preserve"> Light and temperature effects on decomposition. a, b, c, </w:t>
-      </w:r>
-    </w:p>
-    <w:p>
-      <w:pPr>
-        <w:rPr>
-          <w:rFonts w:ascii="Futura Medium" w:hAnsi="Futura Medium" w:cs="Futura Medium"/>
-          <w:sz w:val="20"/>
-          <w:szCs w:val="20"/>
-        </w:rPr>
-      </w:pPr>
-    </w:p>
     <w:sectPr>
-      <w:footerReference w:type="even" r:id="rId11"/>
-      <w:footerReference w:type="default" r:id="rId12"/>
+      <w:footerReference w:type="even" r:id="rId16"/>
+      <w:footerReference w:type="default" r:id="rId17"/>
       <w:pgSz w:w="11906" w:h="16838"/>
       <w:pgMar w:top="1440" w:right="1440" w:bottom="1440" w:left="1440" w:header="708" w:footer="708" w:gutter="0"/>
       <w:cols w:space="708"/>

</xml_diff>